<commit_message>
Homework 2 file with Gantt Chart and WBS
</commit_message>
<xml_diff>
--- a/Smart_Parking_Platform_homework1.docx
+++ b/Smart_Parking_Platform_homework1.docx
@@ -1,6 +1,6 @@
 
 <file path=word/document.xml><?xml version="1.0" encoding="utf-8"?>
-<w:document xmlns:wpc="http://schemas.microsoft.com/office/word/2010/wordprocessingCanvas" xmlns:cx="http://schemas.microsoft.com/office/drawing/2014/chartex" xmlns:cx1="http://schemas.microsoft.com/office/drawing/2015/9/8/chartex" xmlns:cx2="http://schemas.microsoft.com/office/drawing/2015/10/21/chartex" xmlns:cx3="http://schemas.microsoft.com/office/drawing/2016/5/9/chartex" xmlns:cx4="http://schemas.microsoft.com/office/drawing/2016/5/10/chartex" xmlns:cx5="http://schemas.microsoft.com/office/drawing/2016/5/11/chartex" xmlns:cx6="http://schemas.microsoft.com/office/drawing/2016/5/12/chartex" xmlns:cx7="http://schemas.microsoft.com/office/drawing/2016/5/13/chartex" xmlns:cx8="http://schemas.microsoft.com/office/drawing/2016/5/14/chartex" xmlns:mc="http://schemas.openxmlformats.org/markup-compatibility/2006" xmlns:aink="http://schemas.microsoft.com/office/drawing/2016/ink" xmlns:am3d="http://schemas.microsoft.com/office/drawing/2017/model3d" xmlns:o="urn:schemas-microsoft-com:office:office" xmlns:oel="http://schemas.microsoft.com/office/2019/extlst" xmlns:r="http://schemas.openxmlformats.org/officeDocument/2006/relationships" xmlns:m="http://schemas.openxmlformats.org/officeDocument/2006/math" xmlns:v="urn:schemas-microsoft-com:vml" xmlns:wp14="http://schemas.microsoft.com/office/word/2010/wordprocessingDrawing" xmlns:wp="http://schemas.openxmlformats.org/drawingml/2006/wordprocessingDrawing" xmlns:w10="urn:schemas-microsoft-com:office:word" xmlns:w="http://schemas.openxmlformats.org/wordprocessingml/2006/main" xmlns:w14="http://schemas.microsoft.com/office/word/2010/wordml" xmlns:w15="http://schemas.microsoft.com/office/word/2012/wordml" xmlns:w16cex="http://schemas.microsoft.com/office/word/2018/wordml/cex" xmlns:w16cid="http://schemas.microsoft.com/office/word/2016/wordml/cid" xmlns:w16="http://schemas.microsoft.com/office/word/2018/wordml" xmlns:w16du="http://schemas.microsoft.com/office/word/2023/wordml/word16du" xmlns:w16sdtdh="http://schemas.microsoft.com/office/word/2020/wordml/sdtdatahash" xmlns:w16sdtfl="http://schemas.microsoft.com/office/word/2024/wordml/sdtformatlock" xmlns:w16se="http://schemas.microsoft.com/office/word/2015/wordml/symex" xmlns:wpg="http://schemas.microsoft.com/office/word/2010/wordprocessingGroup" xmlns:wpi="http://schemas.microsoft.com/office/word/2010/wordprocessingInk" xmlns:wne="http://schemas.microsoft.com/office/word/2006/wordml" xmlns:wps="http://schemas.microsoft.com/office/word/2010/wordprocessingShape" mc:Ignorable="w14 w15 w16se w16cid w16 w16cex w16sdtdh w16sdtfl w16du wp14">
+<w:document xmlns:wpc="http://schemas.microsoft.com/office/word/2010/wordprocessingCanvas" xmlns:cx="http://schemas.microsoft.com/office/drawing/2014/chartex" xmlns:cx1="http://schemas.microsoft.com/office/drawing/2015/9/8/chartex" xmlns:cx2="http://schemas.microsoft.com/office/drawing/2015/10/21/chartex" xmlns:cx3="http://schemas.microsoft.com/office/drawing/2016/5/9/chartex" xmlns:cx4="http://schemas.microsoft.com/office/drawing/2016/5/10/chartex" xmlns:cx5="http://schemas.microsoft.com/office/drawing/2016/5/11/chartex" xmlns:cx6="http://schemas.microsoft.com/office/drawing/2016/5/12/chartex" xmlns:cx7="http://schemas.microsoft.com/office/drawing/2016/5/13/chartex" xmlns:cx8="http://schemas.microsoft.com/office/drawing/2016/5/14/chartex" xmlns:mc="http://schemas.openxmlformats.org/markup-compatibility/2006" xmlns:aink="http://schemas.microsoft.com/office/drawing/2016/ink" xmlns:am3d="http://schemas.microsoft.com/office/drawing/2017/model3d" xmlns:o="urn:schemas-microsoft-com:office:office" xmlns:oel="http://schemas.microsoft.com/office/2019/extlst" xmlns:r="http://schemas.openxmlformats.org/officeDocument/2006/relationships" xmlns:m="http://schemas.openxmlformats.org/officeDocument/2006/math" xmlns:v="urn:schemas-microsoft-com:vml" xmlns:wp14="http://schemas.microsoft.com/office/word/2010/wordprocessingDrawing" xmlns:wp="http://schemas.openxmlformats.org/drawingml/2006/wordprocessingDrawing" xmlns:w10="urn:schemas-microsoft-com:office:word" xmlns:w="http://schemas.openxmlformats.org/wordprocessingml/2006/main" xmlns:w14="http://schemas.microsoft.com/office/word/2010/wordml" xmlns:w15="http://schemas.microsoft.com/office/word/2012/wordml" xmlns:w16cex="http://schemas.microsoft.com/office/word/2018/wordml/cex" xmlns:w16cid="http://schemas.microsoft.com/office/word/2016/wordml/cid" xmlns:w16="http://schemas.microsoft.com/office/word/2018/wordml" xmlns:w16du="http://schemas.microsoft.com/office/word/2023/wordml/word16du" xmlns:w16sdtdh="http://schemas.microsoft.com/office/word/2020/wordml/sdtdatahash" xmlns:w16sdtfl="http://schemas.microsoft.com/office/word/2024/wordml/sdtformatlock" xmlns:w16se="http://schemas.microsoft.com/office/word/2015/wordml/symex" xmlns:wpg="http://schemas.microsoft.com/office/word/2010/wordprocessingGroup" xmlns:wpi="http://schemas.microsoft.com/office/word/2010/wordprocessingInk" xmlns:wne="http://schemas.microsoft.com/office/word/2006/wordml" xmlns:wps="http://schemas.microsoft.com/office/word/2010/wordprocessingShape" xmlns:a="http://schemas.openxmlformats.org/drawingml/2006/main" xmlns:pic="http://schemas.openxmlformats.org/drawingml/2006/picture" xmlns:a14="http://schemas.microsoft.com/office/drawing/2010/main" mc:Ignorable="w14 w15 w16se w16cid w16 w16cex w16sdtdh w16sdtfl w16du wp14">
   <w:body>
     <w:p>
       <w:pPr>
@@ -79,25 +79,12 @@
         <w:jc w:val="center"/>
       </w:pPr>
       <w:r>
+        <w:rPr/>
         <w:t>Made by</w:t>
       </w:r>
       <w:r>
+        <w:rPr/>
         <w:t>: Aim Prasla</w:t>
-      </w:r>
-    </w:p>
-    <w:p>
-      <w:pPr>
-        <w:spacing w:after="60"/>
-        <w:jc w:val="center"/>
-      </w:pPr>
-      <w:r>
-        <w:t>Homework 1</w:t>
-      </w:r>
-      <w:r>
-        <w:t xml:space="preserve">: </w:t>
-      </w:r>
-      <w:r>
-        <w:t>Draft SRS</w:t>
       </w:r>
     </w:p>
     <w:p>
@@ -119,7 +106,6 @@
         <w:spacing w:before="320" w:after="160"/>
       </w:pPr>
       <w:r>
-        <w:lastRenderedPageBreak/>
         <w:t>1. Research: Existing Software</w:t>
       </w:r>
     </w:p>
@@ -279,12 +265,12 @@
       <w:tblPr>
         <w:tblW w:w="9400" w:type="dxa"/>
         <w:tblBorders>
-          <w:top w:val="single" w:sz="4" w:space="0" w:color="auto"/>
-          <w:left w:val="single" w:sz="4" w:space="0" w:color="auto"/>
-          <w:bottom w:val="single" w:sz="4" w:space="0" w:color="auto"/>
-          <w:right w:val="single" w:sz="4" w:space="0" w:color="auto"/>
-          <w:insideH w:val="single" w:sz="4" w:space="0" w:color="auto"/>
-          <w:insideV w:val="single" w:sz="4" w:space="0" w:color="auto"/>
+          <w:top w:val="single" w:color="auto" w:sz="4" w:space="0"/>
+          <w:left w:val="single" w:color="auto" w:sz="4" w:space="0"/>
+          <w:bottom w:val="single" w:color="auto" w:sz="4" w:space="0"/>
+          <w:right w:val="single" w:color="auto" w:sz="4" w:space="0"/>
+          <w:insideH w:val="single" w:color="auto" w:sz="4" w:space="0"/>
+          <w:insideV w:val="single" w:color="auto" w:sz="4" w:space="0"/>
         </w:tblBorders>
         <w:tblCellMar>
           <w:left w:w="10" w:type="dxa"/>
@@ -560,7 +546,6 @@
         <w:spacing w:before="260" w:after="120"/>
       </w:pPr>
       <w:r>
-        <w:lastRenderedPageBreak/>
         <w:t>1.5 How Our Platform Will Be Different</w:t>
       </w:r>
       <w:r>
@@ -866,7 +851,6 @@
         <w:t xml:space="preserve"> open spaces, books one, pays in the app, and gets through the gate with a QR code or a license plate read. On the other </w:t>
       </w:r>
       <w:r>
-        <w:lastRenderedPageBreak/>
         <w:t>side, parking operators get a dashboard showing live occupancy, pricing controls, and revenue reporting across every garage they manage.</w:t>
       </w:r>
     </w:p>
@@ -1150,7 +1134,6 @@
         <w:ind w:left="504" w:hanging="288"/>
       </w:pPr>
       <w:r>
-        <w:lastRenderedPageBreak/>
         <w:t>2. Driver enters name, email, phone number, and password.</w:t>
       </w:r>
     </w:p>
@@ -1559,7 +1542,6 @@
         <w:spacing w:before="200" w:after="90"/>
       </w:pPr>
       <w:r>
-        <w:lastRenderedPageBreak/>
         <w:t>UC-06: Pay for a Reservation</w:t>
       </w:r>
     </w:p>
@@ -1950,7 +1932,6 @@
           <w:b/>
           <w:bCs/>
         </w:rPr>
-        <w:lastRenderedPageBreak/>
         <w:t>Steps:</w:t>
       </w:r>
     </w:p>
@@ -2334,7 +2315,6 @@
         <w:ind w:left="504" w:hanging="288"/>
       </w:pPr>
       <w:r>
-        <w:lastRenderedPageBreak/>
         <w:t>3. System publishes the new rates and honors the old price on existing bookings.</w:t>
       </w:r>
     </w:p>
@@ -2431,13 +2411,2160 @@
         <w:ind w:left="504" w:hanging="288"/>
       </w:pPr>
       <w:r>
+        <w:rPr/>
         <w:t>4. System emails the user when the change takes effect.</w:t>
+      </w:r>
+    </w:p>
+    <w:p>
+      <w:pPr>
+        <w:pStyle w:val="Normal"/>
+        <w:spacing w:after="180"/>
+        <w:ind w:left="504" w:hanging="288"/>
+      </w:pPr>
+    </w:p>
+    <w:p>
+      <w:pPr>
+        <w:pStyle w:val="Normal"/>
+        <w:spacing w:before="240" w:beforeAutospacing="off" w:after="240" w:afterAutospacing="off"/>
+      </w:pPr>
+      <w:r>
+        <w:rPr/>
+        <w:t>Work Breakdown Structure</w:t>
+      </w:r>
+      <w:r>
+        <w:rPr/>
+        <w:t xml:space="preserve"> (WBS)</w:t>
+      </w:r>
+      <w:r>
+        <w:rPr/>
+        <w:t>:</w:t>
+      </w:r>
+      <w:r>
+        <w:br/>
+      </w:r>
+      <w:r>
+        <w:br/>
+      </w:r>
+      <w:r>
+        <w:rPr>
+          <w:rFonts w:ascii="Calibri" w:hAnsi="Calibri" w:eastAsia="Calibri" w:cs="Calibri"/>
+          <w:b w:val="1"/>
+          <w:bCs w:val="1"/>
+          <w:noProof w:val="0"/>
+          <w:sz w:val="22"/>
+          <w:szCs w:val="22"/>
+          <w:lang w:val="en-US"/>
+        </w:rPr>
+        <w:t>1.0 Authentication</w:t>
+      </w:r>
+    </w:p>
+    <w:p>
+      <w:pPr>
+        <w:pStyle w:val="ListParagraph"/>
+        <w:numPr>
+          <w:ilvl w:val="0"/>
+          <w:numId w:val="3"/>
+        </w:numPr>
+        <w:spacing w:before="0" w:beforeAutospacing="off" w:after="0" w:afterAutospacing="off"/>
+        <w:rPr>
+          <w:rFonts w:ascii="Calibri" w:hAnsi="Calibri" w:eastAsia="Calibri" w:cs="Calibri"/>
+          <w:noProof w:val="0"/>
+          <w:sz w:val="22"/>
+          <w:szCs w:val="22"/>
+          <w:lang w:val="en-US"/>
+        </w:rPr>
+      </w:pPr>
+      <w:r>
+        <w:rPr>
+          <w:rFonts w:ascii="Calibri" w:hAnsi="Calibri" w:eastAsia="Calibri" w:cs="Calibri"/>
+          <w:noProof w:val="0"/>
+          <w:sz w:val="22"/>
+          <w:szCs w:val="22"/>
+          <w:lang w:val="en-US"/>
+        </w:rPr>
+        <w:t xml:space="preserve">1.1 Registration </w:t>
+      </w:r>
+    </w:p>
+    <w:p>
+      <w:pPr>
+        <w:pStyle w:val="ListParagraph"/>
+        <w:numPr>
+          <w:ilvl w:val="1"/>
+          <w:numId w:val="3"/>
+        </w:numPr>
+        <w:spacing w:before="0" w:beforeAutospacing="off" w:after="0" w:afterAutospacing="off"/>
+        <w:rPr>
+          <w:rFonts w:ascii="Calibri" w:hAnsi="Calibri" w:eastAsia="Calibri" w:cs="Calibri"/>
+          <w:noProof w:val="0"/>
+          <w:sz w:val="22"/>
+          <w:szCs w:val="22"/>
+          <w:lang w:val="en-US"/>
+        </w:rPr>
+      </w:pPr>
+      <w:r>
+        <w:rPr>
+          <w:rFonts w:ascii="Calibri" w:hAnsi="Calibri" w:eastAsia="Calibri" w:cs="Calibri"/>
+          <w:noProof w:val="0"/>
+          <w:sz w:val="22"/>
+          <w:szCs w:val="22"/>
+          <w:lang w:val="en-US"/>
+        </w:rPr>
+        <w:t xml:space="preserve">1.1.1 Registration form </w:t>
+      </w:r>
+    </w:p>
+    <w:p>
+      <w:pPr>
+        <w:pStyle w:val="ListParagraph"/>
+        <w:numPr>
+          <w:ilvl w:val="1"/>
+          <w:numId w:val="3"/>
+        </w:numPr>
+        <w:spacing w:before="0" w:beforeAutospacing="off" w:after="0" w:afterAutospacing="off"/>
+        <w:rPr>
+          <w:rFonts w:ascii="Calibri" w:hAnsi="Calibri" w:eastAsia="Calibri" w:cs="Calibri"/>
+          <w:noProof w:val="0"/>
+          <w:sz w:val="22"/>
+          <w:szCs w:val="22"/>
+          <w:lang w:val="en-US"/>
+        </w:rPr>
+      </w:pPr>
+      <w:r>
+        <w:rPr>
+          <w:rFonts w:ascii="Calibri" w:hAnsi="Calibri" w:eastAsia="Calibri" w:cs="Calibri"/>
+          <w:noProof w:val="0"/>
+          <w:sz w:val="22"/>
+          <w:szCs w:val="22"/>
+          <w:lang w:val="en-US"/>
+        </w:rPr>
+        <w:t>1.1.2 Email/SMS verification codes</w:t>
+      </w:r>
+    </w:p>
+    <w:p>
+      <w:pPr>
+        <w:pStyle w:val="ListParagraph"/>
+        <w:numPr>
+          <w:ilvl w:val="0"/>
+          <w:numId w:val="3"/>
+        </w:numPr>
+        <w:spacing w:before="0" w:beforeAutospacing="off" w:after="0" w:afterAutospacing="off"/>
+        <w:rPr>
+          <w:rFonts w:ascii="Calibri" w:hAnsi="Calibri" w:eastAsia="Calibri" w:cs="Calibri"/>
+          <w:noProof w:val="0"/>
+          <w:sz w:val="22"/>
+          <w:szCs w:val="22"/>
+          <w:lang w:val="en-US"/>
+        </w:rPr>
+      </w:pPr>
+      <w:r>
+        <w:rPr>
+          <w:rFonts w:ascii="Calibri" w:hAnsi="Calibri" w:eastAsia="Calibri" w:cs="Calibri"/>
+          <w:noProof w:val="0"/>
+          <w:sz w:val="22"/>
+          <w:szCs w:val="22"/>
+          <w:lang w:val="en-US"/>
+        </w:rPr>
+        <w:t xml:space="preserve">1.2 Login </w:t>
+      </w:r>
+    </w:p>
+    <w:p>
+      <w:pPr>
+        <w:pStyle w:val="ListParagraph"/>
+        <w:numPr>
+          <w:ilvl w:val="1"/>
+          <w:numId w:val="3"/>
+        </w:numPr>
+        <w:spacing w:before="0" w:beforeAutospacing="off" w:after="0" w:afterAutospacing="off"/>
+        <w:rPr>
+          <w:rFonts w:ascii="Calibri" w:hAnsi="Calibri" w:eastAsia="Calibri" w:cs="Calibri"/>
+          <w:noProof w:val="0"/>
+          <w:sz w:val="22"/>
+          <w:szCs w:val="22"/>
+          <w:lang w:val="en-US"/>
+        </w:rPr>
+      </w:pPr>
+      <w:r>
+        <w:rPr>
+          <w:rFonts w:ascii="Calibri" w:hAnsi="Calibri" w:eastAsia="Calibri" w:cs="Calibri"/>
+          <w:noProof w:val="0"/>
+          <w:sz w:val="22"/>
+          <w:szCs w:val="22"/>
+          <w:lang w:val="en-US"/>
+        </w:rPr>
+        <w:t>1.2.1 Credential validation</w:t>
+      </w:r>
+    </w:p>
+    <w:p>
+      <w:pPr>
+        <w:pStyle w:val="ListParagraph"/>
+        <w:numPr>
+          <w:ilvl w:val="1"/>
+          <w:numId w:val="3"/>
+        </w:numPr>
+        <w:spacing w:before="0" w:beforeAutospacing="off" w:after="0" w:afterAutospacing="off"/>
+        <w:rPr>
+          <w:rFonts w:ascii="Calibri" w:hAnsi="Calibri" w:eastAsia="Calibri" w:cs="Calibri"/>
+          <w:noProof w:val="0"/>
+          <w:sz w:val="22"/>
+          <w:szCs w:val="22"/>
+          <w:lang w:val="en-US"/>
+        </w:rPr>
+      </w:pPr>
+      <w:r>
+        <w:rPr>
+          <w:rFonts w:ascii="Calibri" w:hAnsi="Calibri" w:eastAsia="Calibri" w:cs="Calibri"/>
+          <w:noProof w:val="0"/>
+          <w:sz w:val="22"/>
+          <w:szCs w:val="22"/>
+          <w:lang w:val="en-US"/>
+        </w:rPr>
+        <w:t>1.2.2 Password reset</w:t>
+      </w:r>
+    </w:p>
+    <w:p>
+      <w:pPr>
+        <w:pStyle w:val="ListParagraph"/>
+        <w:numPr>
+          <w:ilvl w:val="0"/>
+          <w:numId w:val="3"/>
+        </w:numPr>
+        <w:spacing w:before="0" w:beforeAutospacing="off" w:after="0" w:afterAutospacing="off"/>
+        <w:rPr>
+          <w:rFonts w:ascii="Calibri" w:hAnsi="Calibri" w:eastAsia="Calibri" w:cs="Calibri"/>
+          <w:noProof w:val="0"/>
+          <w:sz w:val="22"/>
+          <w:szCs w:val="22"/>
+          <w:lang w:val="en-US"/>
+        </w:rPr>
+      </w:pPr>
+      <w:r>
+        <w:rPr>
+          <w:rFonts w:ascii="Calibri" w:hAnsi="Calibri" w:eastAsia="Calibri" w:cs="Calibri"/>
+          <w:noProof w:val="0"/>
+          <w:sz w:val="22"/>
+          <w:szCs w:val="22"/>
+          <w:lang w:val="en-US"/>
+        </w:rPr>
+        <w:t xml:space="preserve">1.3 Session Management </w:t>
+      </w:r>
+    </w:p>
+    <w:p>
+      <w:pPr>
+        <w:pStyle w:val="ListParagraph"/>
+        <w:numPr>
+          <w:ilvl w:val="1"/>
+          <w:numId w:val="3"/>
+        </w:numPr>
+        <w:spacing w:before="0" w:beforeAutospacing="off" w:after="0" w:afterAutospacing="off"/>
+        <w:rPr>
+          <w:rFonts w:ascii="Calibri" w:hAnsi="Calibri" w:eastAsia="Calibri" w:cs="Calibri"/>
+          <w:noProof w:val="0"/>
+          <w:sz w:val="22"/>
+          <w:szCs w:val="22"/>
+          <w:lang w:val="en-US"/>
+        </w:rPr>
+      </w:pPr>
+      <w:r>
+        <w:rPr>
+          <w:rFonts w:ascii="Calibri" w:hAnsi="Calibri" w:eastAsia="Calibri" w:cs="Calibri"/>
+          <w:noProof w:val="0"/>
+          <w:sz w:val="22"/>
+          <w:szCs w:val="22"/>
+          <w:lang w:val="en-US"/>
+        </w:rPr>
+        <w:t>1.3.1 Token issue and refresh</w:t>
+      </w:r>
+    </w:p>
+    <w:p>
+      <w:pPr>
+        <w:pStyle w:val="ListParagraph"/>
+        <w:numPr>
+          <w:ilvl w:val="1"/>
+          <w:numId w:val="3"/>
+        </w:numPr>
+        <w:spacing w:before="0" w:beforeAutospacing="off" w:after="0" w:afterAutospacing="off"/>
+        <w:rPr>
+          <w:rFonts w:ascii="Calibri" w:hAnsi="Calibri" w:eastAsia="Calibri" w:cs="Calibri"/>
+          <w:noProof w:val="0"/>
+          <w:sz w:val="22"/>
+          <w:szCs w:val="22"/>
+          <w:lang w:val="en-US"/>
+        </w:rPr>
+      </w:pPr>
+      <w:r>
+        <w:rPr>
+          <w:rFonts w:ascii="Calibri" w:hAnsi="Calibri" w:eastAsia="Calibri" w:cs="Calibri"/>
+          <w:noProof w:val="0"/>
+          <w:sz w:val="22"/>
+          <w:szCs w:val="22"/>
+          <w:lang w:val="en-US"/>
+        </w:rPr>
+        <w:t>1.3.2 Role</w:t>
+      </w:r>
+      <w:r>
+        <w:rPr>
+          <w:rFonts w:ascii="Calibri" w:hAnsi="Calibri" w:eastAsia="Calibri" w:cs="Calibri"/>
+          <w:noProof w:val="0"/>
+          <w:sz w:val="22"/>
+          <w:szCs w:val="22"/>
+          <w:lang w:val="en-US"/>
+        </w:rPr>
+        <w:t xml:space="preserve"> </w:t>
+      </w:r>
+      <w:r>
+        <w:rPr>
+          <w:rFonts w:ascii="Calibri" w:hAnsi="Calibri" w:eastAsia="Calibri" w:cs="Calibri"/>
+          <w:noProof w:val="0"/>
+          <w:sz w:val="22"/>
+          <w:szCs w:val="22"/>
+          <w:lang w:val="en-US"/>
+        </w:rPr>
+        <w:t>based access for driver, operator, and admin</w:t>
+      </w:r>
+    </w:p>
+    <w:p>
+      <w:pPr>
+        <w:spacing w:before="240" w:beforeAutospacing="off" w:after="240" w:afterAutospacing="off"/>
+      </w:pPr>
+      <w:r>
+        <w:rPr>
+          <w:rFonts w:ascii="Calibri" w:hAnsi="Calibri" w:eastAsia="Calibri" w:cs="Calibri"/>
+          <w:b w:val="1"/>
+          <w:bCs w:val="1"/>
+          <w:noProof w:val="0"/>
+          <w:sz w:val="22"/>
+          <w:szCs w:val="22"/>
+          <w:lang w:val="en-US"/>
+        </w:rPr>
+        <w:t>2.0 User and Operator Management</w:t>
+      </w:r>
+    </w:p>
+    <w:p>
+      <w:pPr>
+        <w:pStyle w:val="ListParagraph"/>
+        <w:numPr>
+          <w:ilvl w:val="0"/>
+          <w:numId w:val="4"/>
+        </w:numPr>
+        <w:spacing w:before="0" w:beforeAutospacing="off" w:after="0" w:afterAutospacing="off"/>
+        <w:rPr>
+          <w:rFonts w:ascii="Calibri" w:hAnsi="Calibri" w:eastAsia="Calibri" w:cs="Calibri"/>
+          <w:noProof w:val="0"/>
+          <w:sz w:val="22"/>
+          <w:szCs w:val="22"/>
+          <w:lang w:val="en-US"/>
+        </w:rPr>
+      </w:pPr>
+      <w:r>
+        <w:rPr>
+          <w:rFonts w:ascii="Calibri" w:hAnsi="Calibri" w:eastAsia="Calibri" w:cs="Calibri"/>
+          <w:noProof w:val="0"/>
+          <w:sz w:val="22"/>
+          <w:szCs w:val="22"/>
+          <w:lang w:val="en-US"/>
+        </w:rPr>
+        <w:t xml:space="preserve">2.1 Driver Profile </w:t>
+      </w:r>
+    </w:p>
+    <w:p>
+      <w:pPr>
+        <w:pStyle w:val="ListParagraph"/>
+        <w:numPr>
+          <w:ilvl w:val="1"/>
+          <w:numId w:val="4"/>
+        </w:numPr>
+        <w:spacing w:before="0" w:beforeAutospacing="off" w:after="0" w:afterAutospacing="off"/>
+        <w:rPr>
+          <w:rFonts w:ascii="Calibri" w:hAnsi="Calibri" w:eastAsia="Calibri" w:cs="Calibri"/>
+          <w:noProof w:val="0"/>
+          <w:sz w:val="22"/>
+          <w:szCs w:val="22"/>
+          <w:lang w:val="en-US"/>
+        </w:rPr>
+      </w:pPr>
+      <w:r>
+        <w:rPr>
+          <w:rFonts w:ascii="Calibri" w:hAnsi="Calibri" w:eastAsia="Calibri" w:cs="Calibri"/>
+          <w:noProof w:val="0"/>
+          <w:sz w:val="22"/>
+          <w:szCs w:val="22"/>
+          <w:lang w:val="en-US"/>
+        </w:rPr>
+        <w:t>2.1.1 Profile details</w:t>
+      </w:r>
+    </w:p>
+    <w:p>
+      <w:pPr>
+        <w:pStyle w:val="ListParagraph"/>
+        <w:numPr>
+          <w:ilvl w:val="1"/>
+          <w:numId w:val="4"/>
+        </w:numPr>
+        <w:spacing w:before="0" w:beforeAutospacing="off" w:after="0" w:afterAutospacing="off"/>
+        <w:rPr>
+          <w:rFonts w:ascii="Calibri" w:hAnsi="Calibri" w:eastAsia="Calibri" w:cs="Calibri"/>
+          <w:noProof w:val="0"/>
+          <w:sz w:val="22"/>
+          <w:szCs w:val="22"/>
+          <w:lang w:val="en-US"/>
+        </w:rPr>
+      </w:pPr>
+      <w:r>
+        <w:rPr>
+          <w:rFonts w:ascii="Calibri" w:hAnsi="Calibri" w:eastAsia="Calibri" w:cs="Calibri"/>
+          <w:noProof w:val="0"/>
+          <w:sz w:val="22"/>
+          <w:szCs w:val="22"/>
+          <w:lang w:val="en-US"/>
+        </w:rPr>
+        <w:t>2.1.2 Vehicle license plate list</w:t>
+      </w:r>
+    </w:p>
+    <w:p>
+      <w:pPr>
+        <w:pStyle w:val="ListParagraph"/>
+        <w:numPr>
+          <w:ilvl w:val="0"/>
+          <w:numId w:val="4"/>
+        </w:numPr>
+        <w:spacing w:before="0" w:beforeAutospacing="off" w:after="0" w:afterAutospacing="off"/>
+        <w:rPr>
+          <w:rFonts w:ascii="Calibri" w:hAnsi="Calibri" w:eastAsia="Calibri" w:cs="Calibri"/>
+          <w:noProof w:val="0"/>
+          <w:sz w:val="22"/>
+          <w:szCs w:val="22"/>
+          <w:lang w:val="en-US"/>
+        </w:rPr>
+      </w:pPr>
+      <w:r>
+        <w:rPr>
+          <w:rFonts w:ascii="Calibri" w:hAnsi="Calibri" w:eastAsia="Calibri" w:cs="Calibri"/>
+          <w:noProof w:val="0"/>
+          <w:sz w:val="22"/>
+          <w:szCs w:val="22"/>
+          <w:lang w:val="en-US"/>
+        </w:rPr>
+        <w:t xml:space="preserve">2.2 Operator Accounts </w:t>
+      </w:r>
+    </w:p>
+    <w:p>
+      <w:pPr>
+        <w:pStyle w:val="ListParagraph"/>
+        <w:numPr>
+          <w:ilvl w:val="1"/>
+          <w:numId w:val="4"/>
+        </w:numPr>
+        <w:spacing w:before="0" w:beforeAutospacing="off" w:after="0" w:afterAutospacing="off"/>
+        <w:rPr>
+          <w:rFonts w:ascii="Calibri" w:hAnsi="Calibri" w:eastAsia="Calibri" w:cs="Calibri"/>
+          <w:noProof w:val="0"/>
+          <w:sz w:val="22"/>
+          <w:szCs w:val="22"/>
+          <w:lang w:val="en-US"/>
+        </w:rPr>
+      </w:pPr>
+      <w:r>
+        <w:rPr>
+          <w:rFonts w:ascii="Calibri" w:hAnsi="Calibri" w:eastAsia="Calibri" w:cs="Calibri"/>
+          <w:noProof w:val="0"/>
+          <w:sz w:val="22"/>
+          <w:szCs w:val="22"/>
+          <w:lang w:val="en-US"/>
+        </w:rPr>
+        <w:t>2.2.1 Operator signup and approval</w:t>
+      </w:r>
+    </w:p>
+    <w:p>
+      <w:pPr>
+        <w:pStyle w:val="ListParagraph"/>
+        <w:numPr>
+          <w:ilvl w:val="1"/>
+          <w:numId w:val="4"/>
+        </w:numPr>
+        <w:spacing w:before="0" w:beforeAutospacing="off" w:after="0" w:afterAutospacing="off"/>
+        <w:rPr>
+          <w:rFonts w:ascii="Calibri" w:hAnsi="Calibri" w:eastAsia="Calibri" w:cs="Calibri"/>
+          <w:noProof w:val="0"/>
+          <w:sz w:val="22"/>
+          <w:szCs w:val="22"/>
+          <w:lang w:val="en-US"/>
+        </w:rPr>
+      </w:pPr>
+      <w:r>
+        <w:rPr>
+          <w:rFonts w:ascii="Calibri" w:hAnsi="Calibri" w:eastAsia="Calibri" w:cs="Calibri"/>
+          <w:noProof w:val="0"/>
+          <w:sz w:val="22"/>
+          <w:szCs w:val="22"/>
+          <w:lang w:val="en-US"/>
+        </w:rPr>
+        <w:t>2.2.2 Staff accounts under an operator</w:t>
+      </w:r>
+    </w:p>
+    <w:p>
+      <w:pPr>
+        <w:pStyle w:val="ListParagraph"/>
+        <w:numPr>
+          <w:ilvl w:val="0"/>
+          <w:numId w:val="4"/>
+        </w:numPr>
+        <w:spacing w:before="0" w:beforeAutospacing="off" w:after="0" w:afterAutospacing="off"/>
+        <w:rPr>
+          <w:rFonts w:ascii="Calibri" w:hAnsi="Calibri" w:eastAsia="Calibri" w:cs="Calibri"/>
+          <w:noProof w:val="0"/>
+          <w:sz w:val="22"/>
+          <w:szCs w:val="22"/>
+          <w:lang w:val="en-US"/>
+        </w:rPr>
+      </w:pPr>
+      <w:r>
+        <w:rPr>
+          <w:rFonts w:ascii="Calibri" w:hAnsi="Calibri" w:eastAsia="Calibri" w:cs="Calibri"/>
+          <w:noProof w:val="0"/>
+          <w:sz w:val="22"/>
+          <w:szCs w:val="22"/>
+          <w:lang w:val="en-US"/>
+        </w:rPr>
+        <w:t xml:space="preserve">2.3 Account Administration </w:t>
+      </w:r>
+    </w:p>
+    <w:p>
+      <w:pPr>
+        <w:pStyle w:val="ListParagraph"/>
+        <w:numPr>
+          <w:ilvl w:val="1"/>
+          <w:numId w:val="4"/>
+        </w:numPr>
+        <w:spacing w:before="0" w:beforeAutospacing="off" w:after="0" w:afterAutospacing="off"/>
+        <w:rPr>
+          <w:rFonts w:ascii="Calibri" w:hAnsi="Calibri" w:eastAsia="Calibri" w:cs="Calibri"/>
+          <w:noProof w:val="0"/>
+          <w:sz w:val="22"/>
+          <w:szCs w:val="22"/>
+          <w:lang w:val="en-US"/>
+        </w:rPr>
+      </w:pPr>
+      <w:r>
+        <w:rPr>
+          <w:rFonts w:ascii="Calibri" w:hAnsi="Calibri" w:eastAsia="Calibri" w:cs="Calibri"/>
+          <w:noProof w:val="0"/>
+          <w:sz w:val="22"/>
+          <w:szCs w:val="22"/>
+          <w:lang w:val="en-US"/>
+        </w:rPr>
+        <w:t>2.3.1 Account search and lookup</w:t>
+      </w:r>
+    </w:p>
+    <w:p>
+      <w:pPr>
+        <w:pStyle w:val="ListParagraph"/>
+        <w:numPr>
+          <w:ilvl w:val="1"/>
+          <w:numId w:val="4"/>
+        </w:numPr>
+        <w:spacing w:before="0" w:beforeAutospacing="off" w:after="0" w:afterAutospacing="off"/>
+        <w:rPr>
+          <w:rFonts w:ascii="Calibri" w:hAnsi="Calibri" w:eastAsia="Calibri" w:cs="Calibri"/>
+          <w:noProof w:val="0"/>
+          <w:sz w:val="22"/>
+          <w:szCs w:val="22"/>
+          <w:lang w:val="en-US"/>
+        </w:rPr>
+      </w:pPr>
+      <w:r>
+        <w:rPr>
+          <w:rFonts w:ascii="Calibri" w:hAnsi="Calibri" w:eastAsia="Calibri" w:cs="Calibri"/>
+          <w:noProof w:val="0"/>
+          <w:sz w:val="22"/>
+          <w:szCs w:val="22"/>
+          <w:lang w:val="en-US"/>
+        </w:rPr>
+        <w:t xml:space="preserve">2.3.2 Role changes </w:t>
+      </w:r>
+    </w:p>
+    <w:p>
+      <w:pPr>
+        <w:spacing w:before="240" w:beforeAutospacing="off" w:after="240" w:afterAutospacing="off"/>
+      </w:pPr>
+      <w:r>
+        <w:rPr>
+          <w:rFonts w:ascii="Calibri" w:hAnsi="Calibri" w:eastAsia="Calibri" w:cs="Calibri"/>
+          <w:b w:val="1"/>
+          <w:bCs w:val="1"/>
+          <w:noProof w:val="0"/>
+          <w:sz w:val="22"/>
+          <w:szCs w:val="22"/>
+          <w:lang w:val="en-US"/>
+        </w:rPr>
+        <w:t>3.0 Payments</w:t>
+      </w:r>
+    </w:p>
+    <w:p>
+      <w:pPr>
+        <w:pStyle w:val="ListParagraph"/>
+        <w:numPr>
+          <w:ilvl w:val="0"/>
+          <w:numId w:val="5"/>
+        </w:numPr>
+        <w:spacing w:before="0" w:beforeAutospacing="off" w:after="0" w:afterAutospacing="off"/>
+        <w:rPr>
+          <w:rFonts w:ascii="Calibri" w:hAnsi="Calibri" w:eastAsia="Calibri" w:cs="Calibri"/>
+          <w:noProof w:val="0"/>
+          <w:sz w:val="22"/>
+          <w:szCs w:val="22"/>
+          <w:lang w:val="en-US"/>
+        </w:rPr>
+      </w:pPr>
+      <w:r>
+        <w:rPr>
+          <w:rFonts w:ascii="Calibri" w:hAnsi="Calibri" w:eastAsia="Calibri" w:cs="Calibri"/>
+          <w:noProof w:val="0"/>
+          <w:sz w:val="22"/>
+          <w:szCs w:val="22"/>
+          <w:lang w:val="en-US"/>
+        </w:rPr>
+        <w:t xml:space="preserve">3.1 Payment Methods </w:t>
+      </w:r>
+    </w:p>
+    <w:p>
+      <w:pPr>
+        <w:pStyle w:val="ListParagraph"/>
+        <w:numPr>
+          <w:ilvl w:val="1"/>
+          <w:numId w:val="5"/>
+        </w:numPr>
+        <w:spacing w:before="0" w:beforeAutospacing="off" w:after="0" w:afterAutospacing="off"/>
+        <w:rPr>
+          <w:rFonts w:ascii="Calibri" w:hAnsi="Calibri" w:eastAsia="Calibri" w:cs="Calibri"/>
+          <w:noProof w:val="0"/>
+          <w:sz w:val="22"/>
+          <w:szCs w:val="22"/>
+          <w:lang w:val="en-US"/>
+        </w:rPr>
+      </w:pPr>
+      <w:r>
+        <w:rPr>
+          <w:rFonts w:ascii="Calibri" w:hAnsi="Calibri" w:eastAsia="Calibri" w:cs="Calibri"/>
+          <w:noProof w:val="0"/>
+          <w:sz w:val="22"/>
+          <w:szCs w:val="22"/>
+          <w:lang w:val="en-US"/>
+        </w:rPr>
+        <w:t>3.1.1 Add</w:t>
+      </w:r>
+      <w:r>
+        <w:rPr>
+          <w:rFonts w:ascii="Calibri" w:hAnsi="Calibri" w:eastAsia="Calibri" w:cs="Calibri"/>
+          <w:noProof w:val="0"/>
+          <w:sz w:val="22"/>
+          <w:szCs w:val="22"/>
+          <w:lang w:val="en-US"/>
+        </w:rPr>
+        <w:t>ing card</w:t>
+      </w:r>
+    </w:p>
+    <w:p>
+      <w:pPr>
+        <w:pStyle w:val="ListParagraph"/>
+        <w:numPr>
+          <w:ilvl w:val="1"/>
+          <w:numId w:val="5"/>
+        </w:numPr>
+        <w:spacing w:before="0" w:beforeAutospacing="off" w:after="0" w:afterAutospacing="off"/>
+        <w:rPr>
+          <w:rFonts w:ascii="Calibri" w:hAnsi="Calibri" w:eastAsia="Calibri" w:cs="Calibri"/>
+          <w:noProof w:val="0"/>
+          <w:sz w:val="22"/>
+          <w:szCs w:val="22"/>
+          <w:lang w:val="en-US"/>
+        </w:rPr>
+      </w:pPr>
+      <w:r>
+        <w:rPr>
+          <w:rFonts w:ascii="Calibri" w:hAnsi="Calibri" w:eastAsia="Calibri" w:cs="Calibri"/>
+          <w:noProof w:val="0"/>
+          <w:sz w:val="22"/>
+          <w:szCs w:val="22"/>
+          <w:lang w:val="en-US"/>
+        </w:rPr>
+        <w:t>3.1.2 Default card selection</w:t>
+      </w:r>
+    </w:p>
+    <w:p>
+      <w:pPr>
+        <w:pStyle w:val="ListParagraph"/>
+        <w:numPr>
+          <w:ilvl w:val="1"/>
+          <w:numId w:val="5"/>
+        </w:numPr>
+        <w:spacing w:before="0" w:beforeAutospacing="off" w:after="0" w:afterAutospacing="off"/>
+        <w:rPr>
+          <w:rFonts w:ascii="Calibri" w:hAnsi="Calibri" w:eastAsia="Calibri" w:cs="Calibri"/>
+          <w:noProof w:val="0"/>
+          <w:sz w:val="22"/>
+          <w:szCs w:val="22"/>
+          <w:lang w:val="en-US"/>
+        </w:rPr>
+      </w:pPr>
+      <w:r>
+        <w:rPr>
+          <w:rFonts w:ascii="Calibri" w:hAnsi="Calibri" w:eastAsia="Calibri" w:cs="Calibri"/>
+          <w:noProof w:val="0"/>
+          <w:sz w:val="22"/>
+          <w:szCs w:val="22"/>
+          <w:lang w:val="en-US"/>
+        </w:rPr>
+        <w:t>3.1.3 Card removal</w:t>
+      </w:r>
+    </w:p>
+    <w:p>
+      <w:pPr>
+        <w:pStyle w:val="ListParagraph"/>
+        <w:numPr>
+          <w:ilvl w:val="0"/>
+          <w:numId w:val="5"/>
+        </w:numPr>
+        <w:spacing w:before="0" w:beforeAutospacing="off" w:after="0" w:afterAutospacing="off"/>
+        <w:rPr>
+          <w:rFonts w:ascii="Calibri" w:hAnsi="Calibri" w:eastAsia="Calibri" w:cs="Calibri"/>
+          <w:noProof w:val="0"/>
+          <w:sz w:val="22"/>
+          <w:szCs w:val="22"/>
+          <w:lang w:val="en-US"/>
+        </w:rPr>
+      </w:pPr>
+      <w:r>
+        <w:rPr>
+          <w:rFonts w:ascii="Calibri" w:hAnsi="Calibri" w:eastAsia="Calibri" w:cs="Calibri"/>
+          <w:noProof w:val="0"/>
+          <w:sz w:val="22"/>
+          <w:szCs w:val="22"/>
+          <w:lang w:val="en-US"/>
+        </w:rPr>
+        <w:t xml:space="preserve">3.2 Transactions </w:t>
+      </w:r>
+    </w:p>
+    <w:p>
+      <w:pPr>
+        <w:pStyle w:val="ListParagraph"/>
+        <w:numPr>
+          <w:ilvl w:val="1"/>
+          <w:numId w:val="5"/>
+        </w:numPr>
+        <w:spacing w:before="0" w:beforeAutospacing="off" w:after="0" w:afterAutospacing="off"/>
+        <w:rPr>
+          <w:rFonts w:ascii="Calibri" w:hAnsi="Calibri" w:eastAsia="Calibri" w:cs="Calibri"/>
+          <w:noProof w:val="0"/>
+          <w:sz w:val="22"/>
+          <w:szCs w:val="22"/>
+          <w:lang w:val="en-US"/>
+        </w:rPr>
+      </w:pPr>
+      <w:r>
+        <w:rPr>
+          <w:rFonts w:ascii="Calibri" w:hAnsi="Calibri" w:eastAsia="Calibri" w:cs="Calibri"/>
+          <w:noProof w:val="0"/>
+          <w:sz w:val="22"/>
+          <w:szCs w:val="22"/>
+          <w:lang w:val="en-US"/>
+        </w:rPr>
+        <w:t>3.2.1 Charge authorization</w:t>
+      </w:r>
+    </w:p>
+    <w:p>
+      <w:pPr>
+        <w:pStyle w:val="ListParagraph"/>
+        <w:numPr>
+          <w:ilvl w:val="1"/>
+          <w:numId w:val="5"/>
+        </w:numPr>
+        <w:spacing w:before="0" w:beforeAutospacing="off" w:after="0" w:afterAutospacing="off"/>
+        <w:rPr>
+          <w:rFonts w:ascii="Calibri" w:hAnsi="Calibri" w:eastAsia="Calibri" w:cs="Calibri"/>
+          <w:noProof w:val="0"/>
+          <w:sz w:val="22"/>
+          <w:szCs w:val="22"/>
+          <w:lang w:val="en-US"/>
+        </w:rPr>
+      </w:pPr>
+      <w:r>
+        <w:rPr>
+          <w:rFonts w:ascii="Calibri" w:hAnsi="Calibri" w:eastAsia="Calibri" w:cs="Calibri"/>
+          <w:noProof w:val="0"/>
+          <w:sz w:val="22"/>
+          <w:szCs w:val="22"/>
+          <w:lang w:val="en-US"/>
+        </w:rPr>
+        <w:t xml:space="preserve">3.2.2 Refunds </w:t>
+      </w:r>
+      <w:r>
+        <w:rPr>
+          <w:rFonts w:ascii="Calibri" w:hAnsi="Calibri" w:eastAsia="Calibri" w:cs="Calibri"/>
+          <w:noProof w:val="0"/>
+          <w:sz w:val="22"/>
+          <w:szCs w:val="22"/>
+          <w:lang w:val="en-US"/>
+        </w:rPr>
+        <w:t xml:space="preserve">or </w:t>
+      </w:r>
+      <w:r>
+        <w:rPr>
+          <w:rFonts w:ascii="Calibri" w:hAnsi="Calibri" w:eastAsia="Calibri" w:cs="Calibri"/>
+          <w:noProof w:val="0"/>
+          <w:sz w:val="22"/>
+          <w:szCs w:val="22"/>
+          <w:lang w:val="en-US"/>
+        </w:rPr>
+        <w:t>cancellations</w:t>
+      </w:r>
+    </w:p>
+    <w:p>
+      <w:pPr>
+        <w:pStyle w:val="ListParagraph"/>
+        <w:numPr>
+          <w:ilvl w:val="1"/>
+          <w:numId w:val="5"/>
+        </w:numPr>
+        <w:spacing w:before="0" w:beforeAutospacing="off" w:after="0" w:afterAutospacing="off"/>
+        <w:rPr>
+          <w:rFonts w:ascii="Calibri" w:hAnsi="Calibri" w:eastAsia="Calibri" w:cs="Calibri"/>
+          <w:noProof w:val="0"/>
+          <w:sz w:val="22"/>
+          <w:szCs w:val="22"/>
+          <w:lang w:val="en-US"/>
+        </w:rPr>
+      </w:pPr>
+      <w:r>
+        <w:rPr>
+          <w:rFonts w:ascii="Calibri" w:hAnsi="Calibri" w:eastAsia="Calibri" w:cs="Calibri"/>
+          <w:noProof w:val="0"/>
+          <w:sz w:val="22"/>
+          <w:szCs w:val="22"/>
+          <w:lang w:val="en-US"/>
+        </w:rPr>
+        <w:t>3.2.3 Overstay charges</w:t>
+      </w:r>
+      <w:r>
+        <w:rPr>
+          <w:rFonts w:ascii="Calibri" w:hAnsi="Calibri" w:eastAsia="Calibri" w:cs="Calibri"/>
+          <w:noProof w:val="0"/>
+          <w:sz w:val="22"/>
+          <w:szCs w:val="22"/>
+          <w:lang w:val="en-US"/>
+        </w:rPr>
+        <w:t xml:space="preserve"> </w:t>
+      </w:r>
+    </w:p>
+    <w:p>
+      <w:pPr>
+        <w:pStyle w:val="ListParagraph"/>
+        <w:numPr>
+          <w:ilvl w:val="0"/>
+          <w:numId w:val="5"/>
+        </w:numPr>
+        <w:spacing w:before="0" w:beforeAutospacing="off" w:after="0" w:afterAutospacing="off"/>
+        <w:rPr>
+          <w:rFonts w:ascii="Calibri" w:hAnsi="Calibri" w:eastAsia="Calibri" w:cs="Calibri"/>
+          <w:noProof w:val="0"/>
+          <w:sz w:val="22"/>
+          <w:szCs w:val="22"/>
+          <w:lang w:val="en-US"/>
+        </w:rPr>
+      </w:pPr>
+      <w:r>
+        <w:rPr>
+          <w:rFonts w:ascii="Calibri" w:hAnsi="Calibri" w:eastAsia="Calibri" w:cs="Calibri"/>
+          <w:noProof w:val="0"/>
+          <w:sz w:val="22"/>
+          <w:szCs w:val="22"/>
+          <w:lang w:val="en-US"/>
+        </w:rPr>
+        <w:t xml:space="preserve">3.3 Receipts </w:t>
+      </w:r>
+    </w:p>
+    <w:p>
+      <w:pPr>
+        <w:pStyle w:val="ListParagraph"/>
+        <w:numPr>
+          <w:ilvl w:val="1"/>
+          <w:numId w:val="5"/>
+        </w:numPr>
+        <w:spacing w:before="0" w:beforeAutospacing="off" w:after="0" w:afterAutospacing="off"/>
+        <w:rPr>
+          <w:rFonts w:ascii="Calibri" w:hAnsi="Calibri" w:eastAsia="Calibri" w:cs="Calibri"/>
+          <w:noProof w:val="0"/>
+          <w:sz w:val="22"/>
+          <w:szCs w:val="22"/>
+          <w:lang w:val="en-US"/>
+        </w:rPr>
+      </w:pPr>
+      <w:r>
+        <w:rPr>
+          <w:rFonts w:ascii="Calibri" w:hAnsi="Calibri" w:eastAsia="Calibri" w:cs="Calibri"/>
+          <w:noProof w:val="0"/>
+          <w:sz w:val="22"/>
+          <w:szCs w:val="22"/>
+          <w:lang w:val="en-US"/>
+        </w:rPr>
+        <w:t>3.3.1 Receipt generation</w:t>
+      </w:r>
+    </w:p>
+    <w:p>
+      <w:pPr>
+        <w:pStyle w:val="ListParagraph"/>
+        <w:numPr>
+          <w:ilvl w:val="1"/>
+          <w:numId w:val="5"/>
+        </w:numPr>
+        <w:spacing w:before="0" w:beforeAutospacing="off" w:after="0" w:afterAutospacing="off"/>
+        <w:rPr>
+          <w:rFonts w:ascii="Calibri" w:hAnsi="Calibri" w:eastAsia="Calibri" w:cs="Calibri"/>
+          <w:noProof w:val="0"/>
+          <w:sz w:val="22"/>
+          <w:szCs w:val="22"/>
+          <w:lang w:val="en-US"/>
+        </w:rPr>
+      </w:pPr>
+      <w:r>
+        <w:rPr>
+          <w:rFonts w:ascii="Calibri" w:hAnsi="Calibri" w:eastAsia="Calibri" w:cs="Calibri"/>
+          <w:noProof w:val="0"/>
+          <w:sz w:val="22"/>
+          <w:szCs w:val="22"/>
+          <w:lang w:val="en-US"/>
+        </w:rPr>
+        <w:t>3.3.2 Email delivery</w:t>
+      </w:r>
+      <w:r>
+        <w:rPr>
+          <w:rFonts w:ascii="Calibri" w:hAnsi="Calibri" w:eastAsia="Calibri" w:cs="Calibri"/>
+          <w:noProof w:val="0"/>
+          <w:sz w:val="22"/>
+          <w:szCs w:val="22"/>
+          <w:lang w:val="en-US"/>
+        </w:rPr>
+        <w:t xml:space="preserve"> of receipt</w:t>
+      </w:r>
+    </w:p>
+    <w:p>
+      <w:pPr>
+        <w:spacing w:before="240" w:beforeAutospacing="off" w:after="240" w:afterAutospacing="off"/>
+      </w:pPr>
+      <w:r>
+        <w:rPr>
+          <w:rFonts w:ascii="Calibri" w:hAnsi="Calibri" w:eastAsia="Calibri" w:cs="Calibri"/>
+          <w:b w:val="1"/>
+          <w:bCs w:val="1"/>
+          <w:noProof w:val="0"/>
+          <w:sz w:val="22"/>
+          <w:szCs w:val="22"/>
+          <w:lang w:val="en-US"/>
+        </w:rPr>
+        <w:t>4.0 Driver Dashboard</w:t>
+      </w:r>
+    </w:p>
+    <w:p>
+      <w:pPr>
+        <w:pStyle w:val="ListParagraph"/>
+        <w:numPr>
+          <w:ilvl w:val="0"/>
+          <w:numId w:val="6"/>
+        </w:numPr>
+        <w:spacing w:before="0" w:beforeAutospacing="off" w:after="0" w:afterAutospacing="off"/>
+        <w:rPr>
+          <w:rFonts w:ascii="Calibri" w:hAnsi="Calibri" w:eastAsia="Calibri" w:cs="Calibri"/>
+          <w:noProof w:val="0"/>
+          <w:sz w:val="22"/>
+          <w:szCs w:val="22"/>
+          <w:lang w:val="en-US"/>
+        </w:rPr>
+      </w:pPr>
+      <w:r>
+        <w:rPr>
+          <w:rFonts w:ascii="Calibri" w:hAnsi="Calibri" w:eastAsia="Calibri" w:cs="Calibri"/>
+          <w:noProof w:val="0"/>
+          <w:sz w:val="22"/>
+          <w:szCs w:val="22"/>
+          <w:lang w:val="en-US"/>
+        </w:rPr>
+        <w:t xml:space="preserve">4.1 Find Parking </w:t>
+      </w:r>
+    </w:p>
+    <w:p>
+      <w:pPr>
+        <w:pStyle w:val="ListParagraph"/>
+        <w:numPr>
+          <w:ilvl w:val="1"/>
+          <w:numId w:val="6"/>
+        </w:numPr>
+        <w:spacing w:before="0" w:beforeAutospacing="off" w:after="0" w:afterAutospacing="off"/>
+        <w:rPr>
+          <w:rFonts w:ascii="Calibri" w:hAnsi="Calibri" w:eastAsia="Calibri" w:cs="Calibri"/>
+          <w:noProof w:val="0"/>
+          <w:sz w:val="22"/>
+          <w:szCs w:val="22"/>
+          <w:lang w:val="en-US"/>
+        </w:rPr>
+      </w:pPr>
+      <w:r>
+        <w:rPr>
+          <w:rFonts w:ascii="Calibri" w:hAnsi="Calibri" w:eastAsia="Calibri" w:cs="Calibri"/>
+          <w:noProof w:val="0"/>
+          <w:sz w:val="22"/>
+          <w:szCs w:val="22"/>
+          <w:lang w:val="en-US"/>
+        </w:rPr>
+        <w:t xml:space="preserve">4.1.1 Search by address </w:t>
+      </w:r>
+    </w:p>
+    <w:p>
+      <w:pPr>
+        <w:pStyle w:val="ListParagraph"/>
+        <w:numPr>
+          <w:ilvl w:val="1"/>
+          <w:numId w:val="6"/>
+        </w:numPr>
+        <w:spacing w:before="0" w:beforeAutospacing="off" w:after="0" w:afterAutospacing="off"/>
+        <w:rPr>
+          <w:rFonts w:ascii="Calibri" w:hAnsi="Calibri" w:eastAsia="Calibri" w:cs="Calibri"/>
+          <w:noProof w:val="0"/>
+          <w:sz w:val="22"/>
+          <w:szCs w:val="22"/>
+          <w:lang w:val="en-US"/>
+        </w:rPr>
+      </w:pPr>
+      <w:r>
+        <w:rPr>
+          <w:rFonts w:ascii="Calibri" w:hAnsi="Calibri" w:eastAsia="Calibri" w:cs="Calibri"/>
+          <w:noProof w:val="0"/>
+          <w:sz w:val="22"/>
+          <w:szCs w:val="22"/>
+          <w:lang w:val="en-US"/>
+        </w:rPr>
+        <w:t>4.1.2 Live availability map</w:t>
+      </w:r>
+    </w:p>
+    <w:p>
+      <w:pPr>
+        <w:pStyle w:val="ListParagraph"/>
+        <w:numPr>
+          <w:ilvl w:val="1"/>
+          <w:numId w:val="6"/>
+        </w:numPr>
+        <w:spacing w:before="0" w:beforeAutospacing="off" w:after="0" w:afterAutospacing="off"/>
+        <w:rPr>
+          <w:rFonts w:ascii="Calibri" w:hAnsi="Calibri" w:eastAsia="Calibri" w:cs="Calibri"/>
+          <w:noProof w:val="0"/>
+          <w:sz w:val="22"/>
+          <w:szCs w:val="22"/>
+          <w:lang w:val="en-US"/>
+        </w:rPr>
+      </w:pPr>
+      <w:r>
+        <w:rPr>
+          <w:rFonts w:ascii="Calibri" w:hAnsi="Calibri" w:eastAsia="Calibri" w:cs="Calibri"/>
+          <w:noProof w:val="0"/>
+          <w:sz w:val="22"/>
+          <w:szCs w:val="22"/>
+          <w:lang w:val="en-US"/>
+        </w:rPr>
+        <w:t>4.1.3 Filter and sort results</w:t>
+      </w:r>
+    </w:p>
+    <w:p>
+      <w:pPr>
+        <w:pStyle w:val="ListParagraph"/>
+        <w:numPr>
+          <w:ilvl w:val="0"/>
+          <w:numId w:val="6"/>
+        </w:numPr>
+        <w:spacing w:before="0" w:beforeAutospacing="off" w:after="0" w:afterAutospacing="off"/>
+        <w:rPr>
+          <w:rFonts w:ascii="Calibri" w:hAnsi="Calibri" w:eastAsia="Calibri" w:cs="Calibri"/>
+          <w:noProof w:val="0"/>
+          <w:sz w:val="22"/>
+          <w:szCs w:val="22"/>
+          <w:lang w:val="en-US"/>
+        </w:rPr>
+      </w:pPr>
+      <w:r>
+        <w:rPr>
+          <w:rFonts w:ascii="Calibri" w:hAnsi="Calibri" w:eastAsia="Calibri" w:cs="Calibri"/>
+          <w:noProof w:val="0"/>
+          <w:sz w:val="22"/>
+          <w:szCs w:val="22"/>
+          <w:lang w:val="en-US"/>
+        </w:rPr>
+        <w:t xml:space="preserve">4.2 Reserve and Pay </w:t>
+      </w:r>
+    </w:p>
+    <w:p>
+      <w:pPr>
+        <w:pStyle w:val="ListParagraph"/>
+        <w:numPr>
+          <w:ilvl w:val="1"/>
+          <w:numId w:val="6"/>
+        </w:numPr>
+        <w:spacing w:before="0" w:beforeAutospacing="off" w:after="0" w:afterAutospacing="off"/>
+        <w:rPr>
+          <w:rFonts w:ascii="Calibri" w:hAnsi="Calibri" w:eastAsia="Calibri" w:cs="Calibri"/>
+          <w:noProof w:val="0"/>
+          <w:sz w:val="22"/>
+          <w:szCs w:val="22"/>
+          <w:lang w:val="en-US"/>
+        </w:rPr>
+      </w:pPr>
+      <w:r>
+        <w:rPr>
+          <w:rFonts w:ascii="Calibri" w:hAnsi="Calibri" w:eastAsia="Calibri" w:cs="Calibri"/>
+          <w:noProof w:val="0"/>
+          <w:sz w:val="22"/>
+          <w:szCs w:val="22"/>
+          <w:lang w:val="en-US"/>
+        </w:rPr>
+        <w:t>4.2.1 Reservation creation and hold</w:t>
+      </w:r>
+    </w:p>
+    <w:p>
+      <w:pPr>
+        <w:pStyle w:val="ListParagraph"/>
+        <w:numPr>
+          <w:ilvl w:val="1"/>
+          <w:numId w:val="6"/>
+        </w:numPr>
+        <w:spacing w:before="0" w:beforeAutospacing="off" w:after="0" w:afterAutospacing="off"/>
+        <w:rPr>
+          <w:rFonts w:ascii="Calibri" w:hAnsi="Calibri" w:eastAsia="Calibri" w:cs="Calibri"/>
+          <w:noProof w:val="0"/>
+          <w:sz w:val="22"/>
+          <w:szCs w:val="22"/>
+          <w:lang w:val="en-US"/>
+        </w:rPr>
+      </w:pPr>
+      <w:r>
+        <w:rPr>
+          <w:rFonts w:ascii="Calibri" w:hAnsi="Calibri" w:eastAsia="Calibri" w:cs="Calibri"/>
+          <w:noProof w:val="0"/>
+          <w:sz w:val="22"/>
+          <w:szCs w:val="22"/>
+          <w:lang w:val="en-US"/>
+        </w:rPr>
+        <w:t>4.2.2 Checkout flow</w:t>
+      </w:r>
+    </w:p>
+    <w:p>
+      <w:pPr>
+        <w:pStyle w:val="ListParagraph"/>
+        <w:numPr>
+          <w:ilvl w:val="1"/>
+          <w:numId w:val="6"/>
+        </w:numPr>
+        <w:spacing w:before="0" w:beforeAutospacing="off" w:after="0" w:afterAutospacing="off"/>
+        <w:rPr>
+          <w:rFonts w:ascii="Calibri" w:hAnsi="Calibri" w:eastAsia="Calibri" w:cs="Calibri"/>
+          <w:noProof w:val="0"/>
+          <w:sz w:val="22"/>
+          <w:szCs w:val="22"/>
+          <w:lang w:val="en-US"/>
+        </w:rPr>
+      </w:pPr>
+      <w:r>
+        <w:rPr>
+          <w:rFonts w:ascii="Calibri" w:hAnsi="Calibri" w:eastAsia="Calibri" w:cs="Calibri"/>
+          <w:noProof w:val="0"/>
+          <w:sz w:val="22"/>
+          <w:szCs w:val="22"/>
+          <w:lang w:val="en-US"/>
+        </w:rPr>
+        <w:t xml:space="preserve">4.2.3 Extend </w:t>
+      </w:r>
+      <w:r>
+        <w:rPr>
+          <w:rFonts w:ascii="Calibri" w:hAnsi="Calibri" w:eastAsia="Calibri" w:cs="Calibri"/>
+          <w:noProof w:val="0"/>
+          <w:sz w:val="22"/>
+          <w:szCs w:val="22"/>
+          <w:lang w:val="en-US"/>
+        </w:rPr>
+        <w:t xml:space="preserve">or </w:t>
+      </w:r>
+      <w:r>
+        <w:rPr>
+          <w:rFonts w:ascii="Calibri" w:hAnsi="Calibri" w:eastAsia="Calibri" w:cs="Calibri"/>
+          <w:noProof w:val="0"/>
+          <w:sz w:val="22"/>
+          <w:szCs w:val="22"/>
+          <w:lang w:val="en-US"/>
+        </w:rPr>
+        <w:t>cancel</w:t>
+      </w:r>
+    </w:p>
+    <w:p>
+      <w:pPr>
+        <w:pStyle w:val="ListParagraph"/>
+        <w:numPr>
+          <w:ilvl w:val="0"/>
+          <w:numId w:val="6"/>
+        </w:numPr>
+        <w:spacing w:before="0" w:beforeAutospacing="off" w:after="0" w:afterAutospacing="off"/>
+        <w:rPr>
+          <w:rFonts w:ascii="Calibri" w:hAnsi="Calibri" w:eastAsia="Calibri" w:cs="Calibri"/>
+          <w:noProof w:val="0"/>
+          <w:sz w:val="22"/>
+          <w:szCs w:val="22"/>
+          <w:lang w:val="en-US"/>
+        </w:rPr>
+      </w:pPr>
+      <w:r>
+        <w:rPr>
+          <w:rFonts w:ascii="Calibri" w:hAnsi="Calibri" w:eastAsia="Calibri" w:cs="Calibri"/>
+          <w:noProof w:val="0"/>
+          <w:sz w:val="22"/>
+          <w:szCs w:val="22"/>
+          <w:lang w:val="en-US"/>
+        </w:rPr>
+        <w:t xml:space="preserve">4.3 Park and Exit </w:t>
+      </w:r>
+    </w:p>
+    <w:p>
+      <w:pPr>
+        <w:pStyle w:val="ListParagraph"/>
+        <w:numPr>
+          <w:ilvl w:val="1"/>
+          <w:numId w:val="6"/>
+        </w:numPr>
+        <w:spacing w:before="0" w:beforeAutospacing="off" w:after="0" w:afterAutospacing="off"/>
+        <w:rPr>
+          <w:rFonts w:ascii="Calibri" w:hAnsi="Calibri" w:eastAsia="Calibri" w:cs="Calibri"/>
+          <w:noProof w:val="0"/>
+          <w:sz w:val="22"/>
+          <w:szCs w:val="22"/>
+          <w:lang w:val="en-US"/>
+        </w:rPr>
+      </w:pPr>
+      <w:r>
+        <w:rPr>
+          <w:rFonts w:ascii="Calibri" w:hAnsi="Calibri" w:eastAsia="Calibri" w:cs="Calibri"/>
+          <w:noProof w:val="0"/>
+          <w:sz w:val="22"/>
+          <w:szCs w:val="22"/>
+          <w:lang w:val="en-US"/>
+        </w:rPr>
+        <w:t>4.3.1 QR code and license plate gate entry</w:t>
+      </w:r>
+    </w:p>
+    <w:p>
+      <w:pPr>
+        <w:pStyle w:val="ListParagraph"/>
+        <w:numPr>
+          <w:ilvl w:val="1"/>
+          <w:numId w:val="6"/>
+        </w:numPr>
+        <w:spacing w:before="0" w:beforeAutospacing="off" w:after="0" w:afterAutospacing="off"/>
+        <w:rPr>
+          <w:rFonts w:ascii="Calibri" w:hAnsi="Calibri" w:eastAsia="Calibri" w:cs="Calibri"/>
+          <w:noProof w:val="0"/>
+          <w:sz w:val="22"/>
+          <w:szCs w:val="22"/>
+          <w:lang w:val="en-US"/>
+        </w:rPr>
+      </w:pPr>
+      <w:r>
+        <w:rPr>
+          <w:rFonts w:ascii="Calibri" w:hAnsi="Calibri" w:eastAsia="Calibri" w:cs="Calibri"/>
+          <w:noProof w:val="0"/>
+          <w:sz w:val="22"/>
+          <w:szCs w:val="22"/>
+          <w:lang w:val="en-US"/>
+        </w:rPr>
+        <w:t>4.3.2 In</w:t>
+      </w:r>
+      <w:r>
+        <w:rPr>
+          <w:rFonts w:ascii="Calibri" w:hAnsi="Calibri" w:eastAsia="Calibri" w:cs="Calibri"/>
+          <w:noProof w:val="0"/>
+          <w:sz w:val="22"/>
+          <w:szCs w:val="22"/>
+          <w:lang w:val="en-US"/>
+        </w:rPr>
+        <w:t xml:space="preserve"> </w:t>
+      </w:r>
+      <w:r>
+        <w:rPr>
+          <w:rFonts w:ascii="Calibri" w:hAnsi="Calibri" w:eastAsia="Calibri" w:cs="Calibri"/>
+          <w:noProof w:val="0"/>
+          <w:sz w:val="22"/>
+          <w:szCs w:val="22"/>
+          <w:lang w:val="en-US"/>
+        </w:rPr>
+        <w:t>garage guidance</w:t>
+      </w:r>
+    </w:p>
+    <w:p>
+      <w:pPr>
+        <w:pStyle w:val="ListParagraph"/>
+        <w:numPr>
+          <w:ilvl w:val="1"/>
+          <w:numId w:val="6"/>
+        </w:numPr>
+        <w:spacing w:before="0" w:beforeAutospacing="off" w:after="0" w:afterAutospacing="off"/>
+        <w:rPr>
+          <w:rFonts w:ascii="Calibri" w:hAnsi="Calibri" w:eastAsia="Calibri" w:cs="Calibri"/>
+          <w:noProof w:val="0"/>
+          <w:sz w:val="22"/>
+          <w:szCs w:val="22"/>
+          <w:lang w:val="en-US"/>
+        </w:rPr>
+      </w:pPr>
+      <w:r>
+        <w:rPr>
+          <w:rFonts w:ascii="Calibri" w:hAnsi="Calibri" w:eastAsia="Calibri" w:cs="Calibri"/>
+          <w:noProof w:val="0"/>
+          <w:sz w:val="22"/>
+          <w:szCs w:val="22"/>
+          <w:lang w:val="en-US"/>
+        </w:rPr>
+        <w:t>4.3.3 Exit and session close</w:t>
+      </w:r>
+    </w:p>
+    <w:p>
+      <w:pPr>
+        <w:pStyle w:val="ListParagraph"/>
+        <w:numPr>
+          <w:ilvl w:val="0"/>
+          <w:numId w:val="6"/>
+        </w:numPr>
+        <w:spacing w:before="0" w:beforeAutospacing="off" w:after="0" w:afterAutospacing="off"/>
+        <w:rPr>
+          <w:rFonts w:ascii="Calibri" w:hAnsi="Calibri" w:eastAsia="Calibri" w:cs="Calibri"/>
+          <w:noProof w:val="0"/>
+          <w:sz w:val="22"/>
+          <w:szCs w:val="22"/>
+          <w:lang w:val="en-US"/>
+        </w:rPr>
+      </w:pPr>
+      <w:r>
+        <w:rPr>
+          <w:rFonts w:ascii="Calibri" w:hAnsi="Calibri" w:eastAsia="Calibri" w:cs="Calibri"/>
+          <w:noProof w:val="0"/>
+          <w:sz w:val="22"/>
+          <w:szCs w:val="22"/>
+          <w:lang w:val="en-US"/>
+        </w:rPr>
+        <w:t xml:space="preserve">4.4 Trip History </w:t>
+      </w:r>
+    </w:p>
+    <w:p>
+      <w:pPr>
+        <w:pStyle w:val="ListParagraph"/>
+        <w:numPr>
+          <w:ilvl w:val="1"/>
+          <w:numId w:val="6"/>
+        </w:numPr>
+        <w:spacing w:before="0" w:beforeAutospacing="off" w:after="0" w:afterAutospacing="off"/>
+        <w:rPr>
+          <w:rFonts w:ascii="Calibri" w:hAnsi="Calibri" w:eastAsia="Calibri" w:cs="Calibri"/>
+          <w:noProof w:val="0"/>
+          <w:sz w:val="22"/>
+          <w:szCs w:val="22"/>
+          <w:lang w:val="en-US"/>
+        </w:rPr>
+      </w:pPr>
+      <w:r>
+        <w:rPr>
+          <w:rFonts w:ascii="Calibri" w:hAnsi="Calibri" w:eastAsia="Calibri" w:cs="Calibri"/>
+          <w:noProof w:val="0"/>
+          <w:sz w:val="22"/>
+          <w:szCs w:val="22"/>
+          <w:lang w:val="en-US"/>
+        </w:rPr>
+        <w:t>4.4.1 Past reservation list</w:t>
+      </w:r>
+    </w:p>
+    <w:p>
+      <w:pPr>
+        <w:pStyle w:val="ListParagraph"/>
+        <w:numPr>
+          <w:ilvl w:val="1"/>
+          <w:numId w:val="6"/>
+        </w:numPr>
+        <w:spacing w:before="0" w:beforeAutospacing="off" w:after="0" w:afterAutospacing="off"/>
+        <w:rPr>
+          <w:rFonts w:ascii="Calibri" w:hAnsi="Calibri" w:eastAsia="Calibri" w:cs="Calibri"/>
+          <w:noProof w:val="0"/>
+          <w:sz w:val="22"/>
+          <w:szCs w:val="22"/>
+          <w:lang w:val="en-US"/>
+        </w:rPr>
+      </w:pPr>
+      <w:r>
+        <w:rPr>
+          <w:rFonts w:ascii="Calibri" w:hAnsi="Calibri" w:eastAsia="Calibri" w:cs="Calibri"/>
+          <w:noProof w:val="0"/>
+          <w:sz w:val="22"/>
+          <w:szCs w:val="22"/>
+          <w:lang w:val="en-US"/>
+        </w:rPr>
+        <w:t>4.4.2 Receipt lookup</w:t>
+      </w:r>
+    </w:p>
+    <w:p>
+      <w:pPr>
+        <w:spacing w:before="240" w:beforeAutospacing="off" w:after="240" w:afterAutospacing="off"/>
+      </w:pPr>
+      <w:r>
+        <w:rPr>
+          <w:rFonts w:ascii="Calibri" w:hAnsi="Calibri" w:eastAsia="Calibri" w:cs="Calibri"/>
+          <w:b w:val="1"/>
+          <w:bCs w:val="1"/>
+          <w:noProof w:val="0"/>
+          <w:sz w:val="22"/>
+          <w:szCs w:val="22"/>
+          <w:lang w:val="en-US"/>
+        </w:rPr>
+        <w:t>5.0 Operator Dashboard</w:t>
+      </w:r>
+    </w:p>
+    <w:p>
+      <w:pPr>
+        <w:pStyle w:val="ListParagraph"/>
+        <w:numPr>
+          <w:ilvl w:val="0"/>
+          <w:numId w:val="7"/>
+        </w:numPr>
+        <w:spacing w:before="0" w:beforeAutospacing="off" w:after="0" w:afterAutospacing="off"/>
+        <w:rPr>
+          <w:rFonts w:ascii="Calibri" w:hAnsi="Calibri" w:eastAsia="Calibri" w:cs="Calibri"/>
+          <w:noProof w:val="0"/>
+          <w:sz w:val="22"/>
+          <w:szCs w:val="22"/>
+          <w:lang w:val="en-US"/>
+        </w:rPr>
+      </w:pPr>
+      <w:r>
+        <w:rPr>
+          <w:rFonts w:ascii="Calibri" w:hAnsi="Calibri" w:eastAsia="Calibri" w:cs="Calibri"/>
+          <w:noProof w:val="0"/>
+          <w:sz w:val="22"/>
+          <w:szCs w:val="22"/>
+          <w:lang w:val="en-US"/>
+        </w:rPr>
+        <w:t xml:space="preserve">5.1 Garage Management </w:t>
+      </w:r>
+    </w:p>
+    <w:p>
+      <w:pPr>
+        <w:pStyle w:val="ListParagraph"/>
+        <w:numPr>
+          <w:ilvl w:val="1"/>
+          <w:numId w:val="7"/>
+        </w:numPr>
+        <w:spacing w:before="0" w:beforeAutospacing="off" w:after="0" w:afterAutospacing="off"/>
+        <w:rPr>
+          <w:rFonts w:ascii="Calibri" w:hAnsi="Calibri" w:eastAsia="Calibri" w:cs="Calibri"/>
+          <w:noProof w:val="0"/>
+          <w:sz w:val="22"/>
+          <w:szCs w:val="22"/>
+          <w:lang w:val="en-US"/>
+        </w:rPr>
+      </w:pPr>
+      <w:r>
+        <w:rPr>
+          <w:rFonts w:ascii="Calibri" w:hAnsi="Calibri" w:eastAsia="Calibri" w:cs="Calibri"/>
+          <w:noProof w:val="0"/>
+          <w:sz w:val="22"/>
+          <w:szCs w:val="22"/>
+          <w:lang w:val="en-US"/>
+        </w:rPr>
+        <w:t>5.1.1 Add, edit, and remove garage</w:t>
+      </w:r>
+    </w:p>
+    <w:p>
+      <w:pPr>
+        <w:pStyle w:val="ListParagraph"/>
+        <w:numPr>
+          <w:ilvl w:val="1"/>
+          <w:numId w:val="7"/>
+        </w:numPr>
+        <w:spacing w:before="0" w:beforeAutospacing="off" w:after="0" w:afterAutospacing="off"/>
+        <w:rPr>
+          <w:rFonts w:ascii="Calibri" w:hAnsi="Calibri" w:eastAsia="Calibri" w:cs="Calibri"/>
+          <w:noProof w:val="0"/>
+          <w:sz w:val="22"/>
+          <w:szCs w:val="22"/>
+          <w:lang w:val="en-US"/>
+        </w:rPr>
+      </w:pPr>
+      <w:r>
+        <w:rPr>
+          <w:rFonts w:ascii="Calibri" w:hAnsi="Calibri" w:eastAsia="Calibri" w:cs="Calibri"/>
+          <w:noProof w:val="0"/>
+          <w:sz w:val="22"/>
+          <w:szCs w:val="22"/>
+          <w:lang w:val="en-US"/>
+        </w:rPr>
+        <w:t xml:space="preserve">5.1.2 </w:t>
+      </w:r>
+      <w:r>
+        <w:rPr>
+          <w:rFonts w:ascii="Calibri" w:hAnsi="Calibri" w:eastAsia="Calibri" w:cs="Calibri"/>
+          <w:noProof w:val="0"/>
+          <w:sz w:val="22"/>
+          <w:szCs w:val="22"/>
+          <w:lang w:val="en-US"/>
+        </w:rPr>
+        <w:t>Parking spaces</w:t>
+      </w:r>
+      <w:r>
+        <w:rPr>
+          <w:rFonts w:ascii="Calibri" w:hAnsi="Calibri" w:eastAsia="Calibri" w:cs="Calibri"/>
+          <w:noProof w:val="0"/>
+          <w:sz w:val="22"/>
+          <w:szCs w:val="22"/>
+          <w:lang w:val="en-US"/>
+        </w:rPr>
+        <w:t xml:space="preserve"> </w:t>
+      </w:r>
+      <w:r>
+        <w:rPr>
+          <w:rFonts w:ascii="Calibri" w:hAnsi="Calibri" w:eastAsia="Calibri" w:cs="Calibri"/>
+          <w:noProof w:val="0"/>
+          <w:sz w:val="22"/>
+          <w:szCs w:val="22"/>
+          <w:lang w:val="en-US"/>
+        </w:rPr>
+        <w:t>left</w:t>
+      </w:r>
+    </w:p>
+    <w:p>
+      <w:pPr>
+        <w:pStyle w:val="ListParagraph"/>
+        <w:numPr>
+          <w:ilvl w:val="1"/>
+          <w:numId w:val="7"/>
+        </w:numPr>
+        <w:spacing w:before="0" w:beforeAutospacing="off" w:after="0" w:afterAutospacing="off"/>
+        <w:rPr>
+          <w:rFonts w:ascii="Calibri" w:hAnsi="Calibri" w:eastAsia="Calibri" w:cs="Calibri"/>
+          <w:noProof w:val="0"/>
+          <w:sz w:val="22"/>
+          <w:szCs w:val="22"/>
+          <w:lang w:val="en-US"/>
+        </w:rPr>
+      </w:pPr>
+      <w:r>
+        <w:rPr>
+          <w:rFonts w:ascii="Calibri" w:hAnsi="Calibri" w:eastAsia="Calibri" w:cs="Calibri"/>
+          <w:noProof w:val="0"/>
+          <w:sz w:val="22"/>
+          <w:szCs w:val="22"/>
+          <w:lang w:val="en-US"/>
+        </w:rPr>
+        <w:t xml:space="preserve">5.1.3 </w:t>
+      </w:r>
+      <w:r>
+        <w:rPr>
+          <w:rFonts w:ascii="Calibri" w:hAnsi="Calibri" w:eastAsia="Calibri" w:cs="Calibri"/>
+          <w:noProof w:val="0"/>
+          <w:sz w:val="22"/>
+          <w:szCs w:val="22"/>
+          <w:lang w:val="en-US"/>
+        </w:rPr>
+        <w:t>timing and operations</w:t>
+      </w:r>
+    </w:p>
+    <w:p>
+      <w:pPr>
+        <w:pStyle w:val="ListParagraph"/>
+        <w:numPr>
+          <w:ilvl w:val="0"/>
+          <w:numId w:val="7"/>
+        </w:numPr>
+        <w:spacing w:before="0" w:beforeAutospacing="off" w:after="0" w:afterAutospacing="off"/>
+        <w:rPr>
+          <w:rFonts w:ascii="Calibri" w:hAnsi="Calibri" w:eastAsia="Calibri" w:cs="Calibri"/>
+          <w:noProof w:val="0"/>
+          <w:sz w:val="22"/>
+          <w:szCs w:val="22"/>
+          <w:lang w:val="en-US"/>
+        </w:rPr>
+      </w:pPr>
+      <w:r>
+        <w:rPr>
+          <w:rFonts w:ascii="Calibri" w:hAnsi="Calibri" w:eastAsia="Calibri" w:cs="Calibri"/>
+          <w:noProof w:val="0"/>
+          <w:sz w:val="22"/>
+          <w:szCs w:val="22"/>
+          <w:lang w:val="en-US"/>
+        </w:rPr>
+        <w:t xml:space="preserve">5.2 Pricing </w:t>
+      </w:r>
+    </w:p>
+    <w:p>
+      <w:pPr>
+        <w:pStyle w:val="ListParagraph"/>
+        <w:numPr>
+          <w:ilvl w:val="1"/>
+          <w:numId w:val="7"/>
+        </w:numPr>
+        <w:spacing w:before="0" w:beforeAutospacing="off" w:after="0" w:afterAutospacing="off"/>
+        <w:rPr>
+          <w:rFonts w:ascii="Calibri" w:hAnsi="Calibri" w:eastAsia="Calibri" w:cs="Calibri"/>
+          <w:noProof w:val="0"/>
+          <w:sz w:val="22"/>
+          <w:szCs w:val="22"/>
+          <w:lang w:val="en-US"/>
+        </w:rPr>
+      </w:pPr>
+      <w:r>
+        <w:rPr>
+          <w:rFonts w:ascii="Calibri" w:hAnsi="Calibri" w:eastAsia="Calibri" w:cs="Calibri"/>
+          <w:noProof w:val="0"/>
+          <w:sz w:val="22"/>
+          <w:szCs w:val="22"/>
+          <w:lang w:val="en-US"/>
+        </w:rPr>
+        <w:t>5.2.1 Base hourly and daily maximum rates</w:t>
+      </w:r>
+    </w:p>
+    <w:p>
+      <w:pPr>
+        <w:pStyle w:val="ListParagraph"/>
+        <w:numPr>
+          <w:ilvl w:val="1"/>
+          <w:numId w:val="7"/>
+        </w:numPr>
+        <w:spacing w:before="0" w:beforeAutospacing="off" w:after="0" w:afterAutospacing="off"/>
+        <w:rPr>
+          <w:rFonts w:ascii="Calibri" w:hAnsi="Calibri" w:eastAsia="Calibri" w:cs="Calibri"/>
+          <w:noProof w:val="0"/>
+          <w:sz w:val="22"/>
+          <w:szCs w:val="22"/>
+          <w:lang w:val="en-US"/>
+        </w:rPr>
+      </w:pPr>
+      <w:r>
+        <w:rPr>
+          <w:rFonts w:ascii="Calibri" w:hAnsi="Calibri" w:eastAsia="Calibri" w:cs="Calibri"/>
+          <w:noProof w:val="0"/>
+          <w:sz w:val="22"/>
+          <w:szCs w:val="22"/>
+          <w:lang w:val="en-US"/>
+        </w:rPr>
+        <w:t xml:space="preserve">5.2.2 Weekend </w:t>
+      </w:r>
+      <w:r>
+        <w:rPr>
+          <w:rFonts w:ascii="Calibri" w:hAnsi="Calibri" w:eastAsia="Calibri" w:cs="Calibri"/>
+          <w:noProof w:val="0"/>
+          <w:sz w:val="22"/>
+          <w:szCs w:val="22"/>
+          <w:lang w:val="en-US"/>
+        </w:rPr>
+        <w:t>rates</w:t>
+      </w:r>
+    </w:p>
+    <w:p>
+      <w:pPr>
+        <w:pStyle w:val="ListParagraph"/>
+        <w:numPr>
+          <w:ilvl w:val="1"/>
+          <w:numId w:val="7"/>
+        </w:numPr>
+        <w:spacing w:before="0" w:beforeAutospacing="off" w:after="0" w:afterAutospacing="off"/>
+        <w:rPr>
+          <w:rFonts w:ascii="Calibri" w:hAnsi="Calibri" w:eastAsia="Calibri" w:cs="Calibri"/>
+          <w:noProof w:val="0"/>
+          <w:sz w:val="22"/>
+          <w:szCs w:val="22"/>
+          <w:lang w:val="en-US"/>
+        </w:rPr>
+      </w:pPr>
+      <w:r>
+        <w:rPr>
+          <w:rFonts w:ascii="Calibri" w:hAnsi="Calibri" w:eastAsia="Calibri" w:cs="Calibri"/>
+          <w:noProof w:val="0"/>
+          <w:sz w:val="22"/>
+          <w:szCs w:val="22"/>
+          <w:lang w:val="en-US"/>
+        </w:rPr>
+        <w:t>5.2.3 pricing floor and ceiling</w:t>
+      </w:r>
+    </w:p>
+    <w:p>
+      <w:pPr>
+        <w:pStyle w:val="ListParagraph"/>
+        <w:numPr>
+          <w:ilvl w:val="0"/>
+          <w:numId w:val="7"/>
+        </w:numPr>
+        <w:spacing w:before="0" w:beforeAutospacing="off" w:after="0" w:afterAutospacing="off"/>
+        <w:rPr>
+          <w:rFonts w:ascii="Calibri" w:hAnsi="Calibri" w:eastAsia="Calibri" w:cs="Calibri"/>
+          <w:noProof w:val="0"/>
+          <w:sz w:val="22"/>
+          <w:szCs w:val="22"/>
+          <w:lang w:val="en-US"/>
+        </w:rPr>
+      </w:pPr>
+      <w:r>
+        <w:rPr>
+          <w:rFonts w:ascii="Calibri" w:hAnsi="Calibri" w:eastAsia="Calibri" w:cs="Calibri"/>
+          <w:noProof w:val="0"/>
+          <w:sz w:val="22"/>
+          <w:szCs w:val="22"/>
+          <w:lang w:val="en-US"/>
+        </w:rPr>
+        <w:t xml:space="preserve">5.3 Occupancy Monitoring </w:t>
+      </w:r>
+    </w:p>
+    <w:p>
+      <w:pPr>
+        <w:pStyle w:val="ListParagraph"/>
+        <w:numPr>
+          <w:ilvl w:val="1"/>
+          <w:numId w:val="7"/>
+        </w:numPr>
+        <w:spacing w:before="0" w:beforeAutospacing="off" w:after="0" w:afterAutospacing="off"/>
+        <w:rPr>
+          <w:rFonts w:ascii="Calibri" w:hAnsi="Calibri" w:eastAsia="Calibri" w:cs="Calibri"/>
+          <w:noProof w:val="0"/>
+          <w:sz w:val="22"/>
+          <w:szCs w:val="22"/>
+          <w:lang w:val="en-US"/>
+        </w:rPr>
+      </w:pPr>
+      <w:r>
+        <w:rPr>
+          <w:rFonts w:ascii="Calibri" w:hAnsi="Calibri" w:eastAsia="Calibri" w:cs="Calibri"/>
+          <w:noProof w:val="0"/>
+          <w:sz w:val="22"/>
+          <w:szCs w:val="22"/>
+          <w:lang w:val="en-US"/>
+        </w:rPr>
+        <w:t>5.3.1 Live occupancy view</w:t>
+      </w:r>
+    </w:p>
+    <w:p>
+      <w:pPr>
+        <w:pStyle w:val="ListParagraph"/>
+        <w:numPr>
+          <w:ilvl w:val="1"/>
+          <w:numId w:val="7"/>
+        </w:numPr>
+        <w:spacing w:before="0" w:beforeAutospacing="off" w:after="0" w:afterAutospacing="off"/>
+        <w:rPr>
+          <w:rFonts w:ascii="Calibri" w:hAnsi="Calibri" w:eastAsia="Calibri" w:cs="Calibri"/>
+          <w:noProof w:val="0"/>
+          <w:sz w:val="22"/>
+          <w:szCs w:val="22"/>
+          <w:lang w:val="en-US"/>
+        </w:rPr>
+      </w:pPr>
+      <w:r>
+        <w:rPr>
+          <w:rFonts w:ascii="Calibri" w:hAnsi="Calibri" w:eastAsia="Calibri" w:cs="Calibri"/>
+          <w:noProof w:val="0"/>
+          <w:sz w:val="22"/>
+          <w:szCs w:val="22"/>
+          <w:lang w:val="en-US"/>
+        </w:rPr>
+        <w:t>5.3.2 Entry and exit activity feed</w:t>
+      </w:r>
+    </w:p>
+    <w:p>
+      <w:pPr>
+        <w:pStyle w:val="ListParagraph"/>
+        <w:numPr>
+          <w:ilvl w:val="1"/>
+          <w:numId w:val="7"/>
+        </w:numPr>
+        <w:spacing w:before="0" w:beforeAutospacing="off" w:after="0" w:afterAutospacing="off"/>
+        <w:rPr>
+          <w:rFonts w:ascii="Calibri" w:hAnsi="Calibri" w:eastAsia="Calibri" w:cs="Calibri"/>
+          <w:noProof w:val="0"/>
+          <w:sz w:val="22"/>
+          <w:szCs w:val="22"/>
+          <w:lang w:val="en-US"/>
+        </w:rPr>
+      </w:pPr>
+      <w:r>
+        <w:rPr>
+          <w:rFonts w:ascii="Calibri" w:hAnsi="Calibri" w:eastAsia="Calibri" w:cs="Calibri"/>
+          <w:noProof w:val="0"/>
+          <w:sz w:val="22"/>
+          <w:szCs w:val="22"/>
+          <w:lang w:val="en-US"/>
+        </w:rPr>
+        <w:t>5.3.3 Sensor</w:t>
+      </w:r>
+      <w:r>
+        <w:rPr>
+          <w:rFonts w:ascii="Calibri" w:hAnsi="Calibri" w:eastAsia="Calibri" w:cs="Calibri"/>
+          <w:noProof w:val="0"/>
+          <w:sz w:val="22"/>
+          <w:szCs w:val="22"/>
+          <w:lang w:val="en-US"/>
+        </w:rPr>
+        <w:t xml:space="preserve"> </w:t>
+      </w:r>
+      <w:r>
+        <w:rPr>
+          <w:rFonts w:ascii="Calibri" w:hAnsi="Calibri" w:eastAsia="Calibri" w:cs="Calibri"/>
+          <w:noProof w:val="0"/>
+          <w:sz w:val="22"/>
+          <w:szCs w:val="22"/>
+          <w:lang w:val="en-US"/>
+        </w:rPr>
+        <w:t>alerts</w:t>
+      </w:r>
+    </w:p>
+    <w:p>
+      <w:pPr>
+        <w:spacing w:before="240" w:beforeAutospacing="off" w:after="240" w:afterAutospacing="off"/>
+      </w:pPr>
+      <w:r>
+        <w:rPr>
+          <w:rFonts w:ascii="Calibri" w:hAnsi="Calibri" w:eastAsia="Calibri" w:cs="Calibri"/>
+          <w:b w:val="1"/>
+          <w:bCs w:val="1"/>
+          <w:noProof w:val="0"/>
+          <w:sz w:val="22"/>
+          <w:szCs w:val="22"/>
+          <w:lang w:val="en-US"/>
+        </w:rPr>
+        <w:t>6.0 Reporting</w:t>
+      </w:r>
+    </w:p>
+    <w:p>
+      <w:pPr>
+        <w:pStyle w:val="ListParagraph"/>
+        <w:numPr>
+          <w:ilvl w:val="0"/>
+          <w:numId w:val="8"/>
+        </w:numPr>
+        <w:spacing w:before="0" w:beforeAutospacing="off" w:after="0" w:afterAutospacing="off"/>
+        <w:rPr>
+          <w:rFonts w:ascii="Calibri" w:hAnsi="Calibri" w:eastAsia="Calibri" w:cs="Calibri"/>
+          <w:noProof w:val="0"/>
+          <w:sz w:val="22"/>
+          <w:szCs w:val="22"/>
+          <w:lang w:val="en-US"/>
+        </w:rPr>
+      </w:pPr>
+      <w:r>
+        <w:rPr>
+          <w:rFonts w:ascii="Calibri" w:hAnsi="Calibri" w:eastAsia="Calibri" w:cs="Calibri"/>
+          <w:noProof w:val="0"/>
+          <w:sz w:val="22"/>
+          <w:szCs w:val="22"/>
+          <w:lang w:val="en-US"/>
+        </w:rPr>
+        <w:t xml:space="preserve">6.1 Occupancy Reports </w:t>
+      </w:r>
+    </w:p>
+    <w:p>
+      <w:pPr>
+        <w:pStyle w:val="ListParagraph"/>
+        <w:numPr>
+          <w:ilvl w:val="1"/>
+          <w:numId w:val="8"/>
+        </w:numPr>
+        <w:spacing w:before="0" w:beforeAutospacing="off" w:after="0" w:afterAutospacing="off"/>
+        <w:rPr>
+          <w:rFonts w:ascii="Calibri" w:hAnsi="Calibri" w:eastAsia="Calibri" w:cs="Calibri"/>
+          <w:noProof w:val="0"/>
+          <w:sz w:val="22"/>
+          <w:szCs w:val="22"/>
+          <w:lang w:val="en-US"/>
+        </w:rPr>
+      </w:pPr>
+      <w:r>
+        <w:rPr>
+          <w:rFonts w:ascii="Calibri" w:hAnsi="Calibri" w:eastAsia="Calibri" w:cs="Calibri"/>
+          <w:noProof w:val="0"/>
+          <w:sz w:val="22"/>
+          <w:szCs w:val="22"/>
+          <w:lang w:val="en-US"/>
+        </w:rPr>
+        <w:t>6.1.1 Daily, weekly, and monthly graphs</w:t>
+      </w:r>
+    </w:p>
+    <w:p>
+      <w:pPr>
+        <w:pStyle w:val="ListParagraph"/>
+        <w:numPr>
+          <w:ilvl w:val="1"/>
+          <w:numId w:val="8"/>
+        </w:numPr>
+        <w:spacing w:before="0" w:beforeAutospacing="off" w:after="0" w:afterAutospacing="off"/>
+        <w:rPr>
+          <w:rFonts w:ascii="Calibri" w:hAnsi="Calibri" w:eastAsia="Calibri" w:cs="Calibri"/>
+          <w:noProof w:val="0"/>
+          <w:sz w:val="22"/>
+          <w:szCs w:val="22"/>
+          <w:lang w:val="en-US"/>
+        </w:rPr>
+      </w:pPr>
+      <w:r>
+        <w:rPr>
+          <w:rFonts w:ascii="Calibri" w:hAnsi="Calibri" w:eastAsia="Calibri" w:cs="Calibri"/>
+          <w:noProof w:val="0"/>
+          <w:sz w:val="22"/>
+          <w:szCs w:val="22"/>
+          <w:lang w:val="en-US"/>
+        </w:rPr>
+        <w:t>6.1.2 Facility comparison</w:t>
+      </w:r>
+    </w:p>
+    <w:p>
+      <w:pPr>
+        <w:pStyle w:val="ListParagraph"/>
+        <w:numPr>
+          <w:ilvl w:val="1"/>
+          <w:numId w:val="8"/>
+        </w:numPr>
+        <w:spacing w:before="0" w:beforeAutospacing="off" w:after="0" w:afterAutospacing="off"/>
+        <w:rPr>
+          <w:rFonts w:ascii="Calibri" w:hAnsi="Calibri" w:eastAsia="Calibri" w:cs="Calibri"/>
+          <w:noProof w:val="0"/>
+          <w:sz w:val="22"/>
+          <w:szCs w:val="22"/>
+          <w:lang w:val="en-US"/>
+        </w:rPr>
+      </w:pPr>
+      <w:r>
+        <w:rPr>
+          <w:rFonts w:ascii="Calibri" w:hAnsi="Calibri" w:eastAsia="Calibri" w:cs="Calibri"/>
+          <w:noProof w:val="0"/>
+          <w:sz w:val="22"/>
+          <w:szCs w:val="22"/>
+          <w:lang w:val="en-US"/>
+        </w:rPr>
+        <w:t>6.1.3 Peak utilization analysis</w:t>
+      </w:r>
+    </w:p>
+    <w:p>
+      <w:pPr>
+        <w:pStyle w:val="ListParagraph"/>
+        <w:numPr>
+          <w:ilvl w:val="0"/>
+          <w:numId w:val="8"/>
+        </w:numPr>
+        <w:spacing w:before="0" w:beforeAutospacing="off" w:after="0" w:afterAutospacing="off"/>
+        <w:rPr>
+          <w:rFonts w:ascii="Calibri" w:hAnsi="Calibri" w:eastAsia="Calibri" w:cs="Calibri"/>
+          <w:noProof w:val="0"/>
+          <w:sz w:val="22"/>
+          <w:szCs w:val="22"/>
+          <w:lang w:val="en-US"/>
+        </w:rPr>
+      </w:pPr>
+      <w:r>
+        <w:rPr>
+          <w:rFonts w:ascii="Calibri" w:hAnsi="Calibri" w:eastAsia="Calibri" w:cs="Calibri"/>
+          <w:noProof w:val="0"/>
+          <w:sz w:val="22"/>
+          <w:szCs w:val="22"/>
+          <w:lang w:val="en-US"/>
+        </w:rPr>
+        <w:t xml:space="preserve">6.2 Financial Reports </w:t>
+      </w:r>
+    </w:p>
+    <w:p>
+      <w:pPr>
+        <w:pStyle w:val="ListParagraph"/>
+        <w:numPr>
+          <w:ilvl w:val="1"/>
+          <w:numId w:val="8"/>
+        </w:numPr>
+        <w:spacing w:before="0" w:beforeAutospacing="off" w:after="0" w:afterAutospacing="off"/>
+        <w:rPr>
+          <w:rFonts w:ascii="Calibri" w:hAnsi="Calibri" w:eastAsia="Calibri" w:cs="Calibri"/>
+          <w:noProof w:val="0"/>
+          <w:sz w:val="22"/>
+          <w:szCs w:val="22"/>
+          <w:lang w:val="en-US"/>
+        </w:rPr>
+      </w:pPr>
+      <w:r>
+        <w:rPr>
+          <w:rFonts w:ascii="Calibri" w:hAnsi="Calibri" w:eastAsia="Calibri" w:cs="Calibri"/>
+          <w:noProof w:val="0"/>
+          <w:sz w:val="22"/>
+          <w:szCs w:val="22"/>
+          <w:lang w:val="en-US"/>
+        </w:rPr>
+        <w:t>6.2.1 Revenue by facility</w:t>
+      </w:r>
+    </w:p>
+    <w:p>
+      <w:pPr>
+        <w:pStyle w:val="ListParagraph"/>
+        <w:numPr>
+          <w:ilvl w:val="1"/>
+          <w:numId w:val="8"/>
+        </w:numPr>
+        <w:spacing w:before="0" w:beforeAutospacing="off" w:after="0" w:afterAutospacing="off"/>
+        <w:rPr>
+          <w:rFonts w:ascii="Calibri" w:hAnsi="Calibri" w:eastAsia="Calibri" w:cs="Calibri"/>
+          <w:noProof w:val="0"/>
+          <w:sz w:val="22"/>
+          <w:szCs w:val="22"/>
+          <w:lang w:val="en-US"/>
+        </w:rPr>
+      </w:pPr>
+      <w:r>
+        <w:rPr>
+          <w:rFonts w:ascii="Calibri" w:hAnsi="Calibri" w:eastAsia="Calibri" w:cs="Calibri"/>
+          <w:noProof w:val="0"/>
+          <w:sz w:val="22"/>
+          <w:szCs w:val="22"/>
+          <w:lang w:val="en-US"/>
+        </w:rPr>
+        <w:t>6.2.2 Fees, refunds, and net payout</w:t>
+      </w:r>
+    </w:p>
+    <w:p>
+      <w:pPr>
+        <w:pStyle w:val="ListParagraph"/>
+        <w:numPr>
+          <w:ilvl w:val="1"/>
+          <w:numId w:val="8"/>
+        </w:numPr>
+        <w:spacing w:before="0" w:beforeAutospacing="off" w:after="0" w:afterAutospacing="off"/>
+        <w:rPr>
+          <w:rFonts w:ascii="Calibri" w:hAnsi="Calibri" w:eastAsia="Calibri" w:cs="Calibri"/>
+          <w:noProof w:val="0"/>
+          <w:sz w:val="22"/>
+          <w:szCs w:val="22"/>
+          <w:lang w:val="en-US"/>
+        </w:rPr>
+      </w:pPr>
+      <w:r>
+        <w:rPr>
+          <w:rFonts w:ascii="Calibri" w:hAnsi="Calibri" w:eastAsia="Calibri" w:cs="Calibri"/>
+          <w:noProof w:val="0"/>
+          <w:sz w:val="22"/>
+          <w:szCs w:val="22"/>
+          <w:lang w:val="en-US"/>
+        </w:rPr>
+        <w:t xml:space="preserve">6.2.3 Export </w:t>
+      </w:r>
+      <w:r>
+        <w:rPr>
+          <w:rFonts w:ascii="Calibri" w:hAnsi="Calibri" w:eastAsia="Calibri" w:cs="Calibri"/>
+          <w:noProof w:val="0"/>
+          <w:sz w:val="22"/>
+          <w:szCs w:val="22"/>
+          <w:lang w:val="en-US"/>
+        </w:rPr>
+        <w:t>reports</w:t>
+      </w:r>
+    </w:p>
+    <w:p>
+      <w:pPr>
+        <w:pStyle w:val="Normal"/>
+        <w:spacing w:after="180"/>
+        <w:ind w:left="0" w:hanging="0"/>
+      </w:pPr>
+    </w:p>
+    <w:p>
+      <w:pPr>
+        <w:pStyle w:val="Normal"/>
+        <w:spacing w:after="180"/>
+        <w:ind w:left="0" w:hanging="0"/>
+      </w:pPr>
+      <w:r>
+        <w:rPr/>
+        <w:t>GANTT Chart</w:t>
+      </w:r>
+      <w:r>
+        <w:rPr/>
+        <w:t xml:space="preserve"> based on </w:t>
+      </w:r>
+      <w:r>
+        <w:rPr/>
+        <w:t>today's</w:t>
+      </w:r>
+      <w:r>
+        <w:rPr/>
+        <w:t xml:space="preserve"> date. (This can be updated based on when project development </w:t>
+      </w:r>
+      <w:r>
+        <w:rPr/>
+        <w:t xml:space="preserve">actually </w:t>
+      </w:r>
+      <w:r>
+        <w:rPr/>
+        <w:t>starts</w:t>
+      </w:r>
+      <w:r>
+        <w:rPr/>
+        <w:t>).</w:t>
+      </w:r>
+      <w:r>
+        <w:rPr/>
+        <w:t xml:space="preserve"> Estimated to be completed in 2 months.</w:t>
+      </w:r>
+    </w:p>
+    <w:p>
+      <w:pPr>
+        <w:pStyle w:val="Normal"/>
+        <w:spacing w:after="180"/>
+        <w:ind w:left="0" w:hanging="0"/>
+      </w:pPr>
+      <w:r>
+        <w:drawing>
+          <wp:inline wp14:editId="752D66B1" wp14:anchorId="1D7C58EA">
+            <wp:extent cx="6172200" cy="3990975"/>
+            <wp:effectExtent l="0" t="0" r="0" b="0"/>
+            <wp:docPr id="1491527176" name="drawing"/>
+            <wp:cNvGraphicFramePr>
+              <a:graphicFrameLocks noChangeAspect="1"/>
+            </wp:cNvGraphicFramePr>
+            <a:graphic>
+              <a:graphicData xmlns:a="http://schemas.openxmlformats.org/drawingml/2006/main" uri="http://schemas.openxmlformats.org/drawingml/2006/picture">
+                <pic:pic xmlns:pic="http://schemas.openxmlformats.org/drawingml/2006/picture">
+                  <pic:nvPicPr>
+                    <pic:cNvPr id="1491527176" name="Picture 1491527176"/>
+                    <pic:cNvPicPr/>
+                  </pic:nvPicPr>
+                  <pic:blipFill>
+                    <a:blip xmlns:r="http://schemas.openxmlformats.org/officeDocument/2006/relationships" r:embed="rId1427790585">
+                      <a:extLst>
+                        <a:ext uri="{28A0092B-C50C-407E-A947-70E740481C1C}">
+                          <a14:useLocalDpi xmlns:a14="http://schemas.microsoft.com/office/drawing/2010/main"/>
+                        </a:ext>
+                      </a:extLst>
+                    </a:blip>
+                    <a:stretch>
+                      <a:fillRect/>
+                    </a:stretch>
+                  </pic:blipFill>
+                  <pic:spPr>
+                    <a:xfrm>
+                      <a:off x="0" y="0"/>
+                      <a:ext cx="6172200" cy="3990975"/>
+                    </a:xfrm>
+                    <a:prstGeom prst="rect">
+                      <a:avLst/>
+                    </a:prstGeom>
+                  </pic:spPr>
+                </pic:pic>
+              </a:graphicData>
+            </a:graphic>
+          </wp:inline>
+        </w:drawing>
+      </w:r>
+      <w:r>
+        <w:rPr/>
+        <w:t xml:space="preserve"> </w:t>
       </w:r>
     </w:p>
     <w:sectPr>
       <w:headerReference w:type="default" r:id="rId7"/>
       <w:footerReference w:type="default" r:id="rId8"/>
-      <w:pgSz w:w="12240" w:h="15840"/>
+      <w:pgSz w:w="12240" w:h="15840" w:orient="portrait"/>
       <w:pgMar w:top="1080" w:right="1260" w:bottom="1080" w:left="1260" w:header="708" w:footer="708" w:gutter="0"/>
       <w:cols w:space="720"/>
       <w:docGrid w:linePitch="360"/>
@@ -2503,7 +4630,14 @@
         <w:sz w:val="18"/>
         <w:szCs w:val="18"/>
       </w:rPr>
-      <w:t xml:space="preserve">                                                                                                                                                           </w:t>
+      <w:t xml:space="preserve">                                                                                                                                            </w:t>
+    </w:r>
+    <w:r>
+      <w:rPr>
+        <w:sz w:val="18"/>
+        <w:szCs w:val="18"/>
+      </w:rPr>
+      <w:t xml:space="preserve"> </w:t>
     </w:r>
     <w:r>
       <w:rPr>
@@ -2514,6 +4648,7 @@
     </w:r>
     <w:r>
       <w:rPr>
+        <w:noProof/>
         <w:sz w:val="18"/>
         <w:szCs w:val="18"/>
       </w:rPr>
@@ -2524,7 +4659,7 @@
         <w:sz w:val="18"/>
         <w:szCs w:val="18"/>
       </w:rPr>
-      <w:instrText>PAGE</w:instrText>
+      <w:instrText xml:space="preserve">PAGE</w:instrText>
     </w:r>
     <w:r>
       <w:rPr>
@@ -2543,6 +4678,7 @@
     </w:r>
     <w:r>
       <w:rPr>
+        <w:noProof/>
         <w:sz w:val="18"/>
         <w:szCs w:val="18"/>
       </w:rPr>
@@ -2557,6 +4693,7 @@
     </w:r>
     <w:r>
       <w:rPr>
+        <w:noProof/>
         <w:sz w:val="18"/>
         <w:szCs w:val="18"/>
       </w:rPr>
@@ -2567,7 +4704,7 @@
         <w:sz w:val="18"/>
         <w:szCs w:val="18"/>
       </w:rPr>
-      <w:instrText>NUMPAGES</w:instrText>
+      <w:instrText xml:space="preserve">NUMPAGES</w:instrText>
     </w:r>
     <w:r>
       <w:rPr>
@@ -2586,6 +4723,7 @@
     </w:r>
     <w:r>
       <w:rPr>
+        <w:noProof/>
         <w:sz w:val="18"/>
         <w:szCs w:val="18"/>
       </w:rPr>
@@ -2625,22 +4763,21 @@
   <w:p>
     <w:pPr>
       <w:pBdr>
-        <w:bottom w:val="single" w:sz="6" w:space="6" w:color="BFBFBF"/>
+        <w:bottom w:val="single" w:color="BFBFBF" w:sz="6" w:space="6"/>
       </w:pBdr>
       <w:tabs>
         <w:tab w:val="right" w:pos="9720"/>
       </w:tabs>
       <w:spacing w:after="120"/>
+      <w:ind w:firstLine="0"/>
     </w:pPr>
     <w:r>
       <w:rPr>
         <w:sz w:val="18"/>
         <w:szCs w:val="18"/>
       </w:rPr>
-      <w:tab/>
       <w:t>$</w:t>
     </w:r>
-    <w:proofErr w:type="spellStart"/>
     <w:r>
       <w:rPr>
         <w:sz w:val="18"/>
@@ -2648,7 +4785,6 @@
       </w:rPr>
       <w:t>oftware</w:t>
     </w:r>
-    <w:proofErr w:type="spellEnd"/>
     <w:r>
       <w:rPr>
         <w:sz w:val="18"/>
@@ -2656,7 +4792,6 @@
       </w:rPr>
       <w:t xml:space="preserve"> ¢</w:t>
     </w:r>
-    <w:proofErr w:type="spellStart"/>
     <w:r>
       <w:rPr>
         <w:sz w:val="18"/>
@@ -2664,7 +4799,6 @@
       </w:rPr>
       <w:t>orp</w:t>
     </w:r>
-    <w:proofErr w:type="spellEnd"/>
     <w:r>
       <w:rPr>
         <w:sz w:val="18"/>
@@ -2678,6 +4812,678 @@
 
 <file path=word/numbering.xml><?xml version="1.0" encoding="utf-8"?>
 <w:numbering xmlns:wpc="http://schemas.microsoft.com/office/word/2010/wordprocessingCanvas" xmlns:cx="http://schemas.microsoft.com/office/drawing/2014/chartex" xmlns:cx1="http://schemas.microsoft.com/office/drawing/2015/9/8/chartex" xmlns:cx2="http://schemas.microsoft.com/office/drawing/2015/10/21/chartex" xmlns:cx3="http://schemas.microsoft.com/office/drawing/2016/5/9/chartex" xmlns:cx4="http://schemas.microsoft.com/office/drawing/2016/5/10/chartex" xmlns:cx5="http://schemas.microsoft.com/office/drawing/2016/5/11/chartex" xmlns:cx6="http://schemas.microsoft.com/office/drawing/2016/5/12/chartex" xmlns:cx7="http://schemas.microsoft.com/office/drawing/2016/5/13/chartex" xmlns:cx8="http://schemas.microsoft.com/office/drawing/2016/5/14/chartex" xmlns:mc="http://schemas.openxmlformats.org/markup-compatibility/2006" xmlns:aink="http://schemas.microsoft.com/office/drawing/2016/ink" xmlns:am3d="http://schemas.microsoft.com/office/drawing/2017/model3d" xmlns:o="urn:schemas-microsoft-com:office:office" xmlns:oel="http://schemas.microsoft.com/office/2019/extlst" xmlns:r="http://schemas.openxmlformats.org/officeDocument/2006/relationships" xmlns:m="http://schemas.openxmlformats.org/officeDocument/2006/math" xmlns:v="urn:schemas-microsoft-com:vml" xmlns:wp14="http://schemas.microsoft.com/office/word/2010/wordprocessingDrawing" xmlns:wp="http://schemas.openxmlformats.org/drawingml/2006/wordprocessingDrawing" xmlns:w10="urn:schemas-microsoft-com:office:word" xmlns:w="http://schemas.openxmlformats.org/wordprocessingml/2006/main" xmlns:w14="http://schemas.microsoft.com/office/word/2010/wordml" xmlns:w15="http://schemas.microsoft.com/office/word/2012/wordml" xmlns:w16cex="http://schemas.microsoft.com/office/word/2018/wordml/cex" xmlns:w16cid="http://schemas.microsoft.com/office/word/2016/wordml/cid" xmlns:w16="http://schemas.microsoft.com/office/word/2018/wordml" xmlns:w16du="http://schemas.microsoft.com/office/word/2023/wordml/word16du" xmlns:w16sdtdh="http://schemas.microsoft.com/office/word/2020/wordml/sdtdatahash" xmlns:w16sdtfl="http://schemas.microsoft.com/office/word/2024/wordml/sdtformatlock" xmlns:w16se="http://schemas.microsoft.com/office/word/2015/wordml/symex" xmlns:wpg="http://schemas.microsoft.com/office/word/2010/wordprocessingGroup" xmlns:wpi="http://schemas.microsoft.com/office/word/2010/wordprocessingInk" xmlns:wne="http://schemas.microsoft.com/office/word/2006/wordml" xmlns:wps="http://schemas.microsoft.com/office/word/2010/wordprocessingShape" mc:Ignorable="w14 w15 w16se w16cid w16 w16cex w16sdtdh w16sdtfl w16du wp14">
+  <w:abstractNum xmlns:w="http://schemas.openxmlformats.org/wordprocessingml/2006/main" w:abstractNumId="7">
+    <w:nsid w:val="6e0d1aab"/>
+    <w:multiLevelType xmlns:w="http://schemas.openxmlformats.org/wordprocessingml/2006/main" w:val="hybridMultilevel"/>
+    <w:lvl xmlns:w="http://schemas.openxmlformats.org/wordprocessingml/2006/main" w:ilvl="0">
+      <w:start w:val="1"/>
+      <w:numFmt w:val="bullet"/>
+      <w:lvlText w:val=""/>
+      <w:lvlJc w:val="left"/>
+      <w:pPr>
+        <w:ind w:left="720" w:hanging="360"/>
+      </w:pPr>
+      <w:rPr>
+        <w:rFonts w:hint="default" w:ascii="Symbol" w:hAnsi="Symbol"/>
+      </w:rPr>
+    </w:lvl>
+    <w:lvl xmlns:w="http://schemas.openxmlformats.org/wordprocessingml/2006/main" w:ilvl="1">
+      <w:start w:val="1"/>
+      <w:numFmt w:val="bullet"/>
+      <w:lvlText w:val="o"/>
+      <w:lvlJc w:val="left"/>
+      <w:pPr>
+        <w:ind w:left="1440" w:hanging="360"/>
+      </w:pPr>
+      <w:rPr>
+        <w:rFonts w:hint="default" w:ascii="Courier New" w:hAnsi="Courier New"/>
+      </w:rPr>
+    </w:lvl>
+    <w:lvl xmlns:w="http://schemas.openxmlformats.org/wordprocessingml/2006/main" w:ilvl="2">
+      <w:start w:val="1"/>
+      <w:numFmt w:val="bullet"/>
+      <w:lvlText w:val=""/>
+      <w:lvlJc w:val="left"/>
+      <w:pPr>
+        <w:ind w:left="2160" w:hanging="360"/>
+      </w:pPr>
+      <w:rPr>
+        <w:rFonts w:hint="default" w:ascii="Wingdings" w:hAnsi="Wingdings"/>
+      </w:rPr>
+    </w:lvl>
+    <w:lvl xmlns:w="http://schemas.openxmlformats.org/wordprocessingml/2006/main" w:ilvl="3">
+      <w:start w:val="1"/>
+      <w:numFmt w:val="bullet"/>
+      <w:lvlText w:val=""/>
+      <w:lvlJc w:val="left"/>
+      <w:pPr>
+        <w:ind w:left="2880" w:hanging="360"/>
+      </w:pPr>
+      <w:rPr>
+        <w:rFonts w:hint="default" w:ascii="Symbol" w:hAnsi="Symbol"/>
+      </w:rPr>
+    </w:lvl>
+    <w:lvl xmlns:w="http://schemas.openxmlformats.org/wordprocessingml/2006/main" w:ilvl="4">
+      <w:start w:val="1"/>
+      <w:numFmt w:val="bullet"/>
+      <w:lvlText w:val="o"/>
+      <w:lvlJc w:val="left"/>
+      <w:pPr>
+        <w:ind w:left="3600" w:hanging="360"/>
+      </w:pPr>
+      <w:rPr>
+        <w:rFonts w:hint="default" w:ascii="Courier New" w:hAnsi="Courier New"/>
+      </w:rPr>
+    </w:lvl>
+    <w:lvl xmlns:w="http://schemas.openxmlformats.org/wordprocessingml/2006/main" w:ilvl="5">
+      <w:start w:val="1"/>
+      <w:numFmt w:val="bullet"/>
+      <w:lvlText w:val=""/>
+      <w:lvlJc w:val="left"/>
+      <w:pPr>
+        <w:ind w:left="4320" w:hanging="360"/>
+      </w:pPr>
+      <w:rPr>
+        <w:rFonts w:hint="default" w:ascii="Wingdings" w:hAnsi="Wingdings"/>
+      </w:rPr>
+    </w:lvl>
+    <w:lvl xmlns:w="http://schemas.openxmlformats.org/wordprocessingml/2006/main" w:ilvl="6">
+      <w:start w:val="1"/>
+      <w:numFmt w:val="bullet"/>
+      <w:lvlText w:val=""/>
+      <w:lvlJc w:val="left"/>
+      <w:pPr>
+        <w:ind w:left="5040" w:hanging="360"/>
+      </w:pPr>
+      <w:rPr>
+        <w:rFonts w:hint="default" w:ascii="Symbol" w:hAnsi="Symbol"/>
+      </w:rPr>
+    </w:lvl>
+    <w:lvl xmlns:w="http://schemas.openxmlformats.org/wordprocessingml/2006/main" w:ilvl="7">
+      <w:start w:val="1"/>
+      <w:numFmt w:val="bullet"/>
+      <w:lvlText w:val="o"/>
+      <w:lvlJc w:val="left"/>
+      <w:pPr>
+        <w:ind w:left="5760" w:hanging="360"/>
+      </w:pPr>
+      <w:rPr>
+        <w:rFonts w:hint="default" w:ascii="Courier New" w:hAnsi="Courier New"/>
+      </w:rPr>
+    </w:lvl>
+    <w:lvl xmlns:w="http://schemas.openxmlformats.org/wordprocessingml/2006/main" w:ilvl="8">
+      <w:start w:val="1"/>
+      <w:numFmt w:val="bullet"/>
+      <w:lvlText w:val=""/>
+      <w:lvlJc w:val="left"/>
+      <w:pPr>
+        <w:ind w:left="6480" w:hanging="360"/>
+      </w:pPr>
+      <w:rPr>
+        <w:rFonts w:hint="default" w:ascii="Wingdings" w:hAnsi="Wingdings"/>
+      </w:rPr>
+    </w:lvl>
+  </w:abstractNum>
+  <w:abstractNum xmlns:w="http://schemas.openxmlformats.org/wordprocessingml/2006/main" w:abstractNumId="6">
+    <w:nsid w:val="1c916312"/>
+    <w:multiLevelType xmlns:w="http://schemas.openxmlformats.org/wordprocessingml/2006/main" w:val="hybridMultilevel"/>
+    <w:lvl xmlns:w="http://schemas.openxmlformats.org/wordprocessingml/2006/main" w:ilvl="0">
+      <w:start w:val="1"/>
+      <w:numFmt w:val="bullet"/>
+      <w:lvlText w:val=""/>
+      <w:lvlJc w:val="left"/>
+      <w:pPr>
+        <w:ind w:left="720" w:hanging="360"/>
+      </w:pPr>
+      <w:rPr>
+        <w:rFonts w:hint="default" w:ascii="Symbol" w:hAnsi="Symbol"/>
+      </w:rPr>
+    </w:lvl>
+    <w:lvl xmlns:w="http://schemas.openxmlformats.org/wordprocessingml/2006/main" w:ilvl="1">
+      <w:start w:val="1"/>
+      <w:numFmt w:val="bullet"/>
+      <w:lvlText w:val="o"/>
+      <w:lvlJc w:val="left"/>
+      <w:pPr>
+        <w:ind w:left="1440" w:hanging="360"/>
+      </w:pPr>
+      <w:rPr>
+        <w:rFonts w:hint="default" w:ascii="Courier New" w:hAnsi="Courier New"/>
+      </w:rPr>
+    </w:lvl>
+    <w:lvl xmlns:w="http://schemas.openxmlformats.org/wordprocessingml/2006/main" w:ilvl="2">
+      <w:start w:val="1"/>
+      <w:numFmt w:val="bullet"/>
+      <w:lvlText w:val=""/>
+      <w:lvlJc w:val="left"/>
+      <w:pPr>
+        <w:ind w:left="2160" w:hanging="360"/>
+      </w:pPr>
+      <w:rPr>
+        <w:rFonts w:hint="default" w:ascii="Wingdings" w:hAnsi="Wingdings"/>
+      </w:rPr>
+    </w:lvl>
+    <w:lvl xmlns:w="http://schemas.openxmlformats.org/wordprocessingml/2006/main" w:ilvl="3">
+      <w:start w:val="1"/>
+      <w:numFmt w:val="bullet"/>
+      <w:lvlText w:val=""/>
+      <w:lvlJc w:val="left"/>
+      <w:pPr>
+        <w:ind w:left="2880" w:hanging="360"/>
+      </w:pPr>
+      <w:rPr>
+        <w:rFonts w:hint="default" w:ascii="Symbol" w:hAnsi="Symbol"/>
+      </w:rPr>
+    </w:lvl>
+    <w:lvl xmlns:w="http://schemas.openxmlformats.org/wordprocessingml/2006/main" w:ilvl="4">
+      <w:start w:val="1"/>
+      <w:numFmt w:val="bullet"/>
+      <w:lvlText w:val="o"/>
+      <w:lvlJc w:val="left"/>
+      <w:pPr>
+        <w:ind w:left="3600" w:hanging="360"/>
+      </w:pPr>
+      <w:rPr>
+        <w:rFonts w:hint="default" w:ascii="Courier New" w:hAnsi="Courier New"/>
+      </w:rPr>
+    </w:lvl>
+    <w:lvl xmlns:w="http://schemas.openxmlformats.org/wordprocessingml/2006/main" w:ilvl="5">
+      <w:start w:val="1"/>
+      <w:numFmt w:val="bullet"/>
+      <w:lvlText w:val=""/>
+      <w:lvlJc w:val="left"/>
+      <w:pPr>
+        <w:ind w:left="4320" w:hanging="360"/>
+      </w:pPr>
+      <w:rPr>
+        <w:rFonts w:hint="default" w:ascii="Wingdings" w:hAnsi="Wingdings"/>
+      </w:rPr>
+    </w:lvl>
+    <w:lvl xmlns:w="http://schemas.openxmlformats.org/wordprocessingml/2006/main" w:ilvl="6">
+      <w:start w:val="1"/>
+      <w:numFmt w:val="bullet"/>
+      <w:lvlText w:val=""/>
+      <w:lvlJc w:val="left"/>
+      <w:pPr>
+        <w:ind w:left="5040" w:hanging="360"/>
+      </w:pPr>
+      <w:rPr>
+        <w:rFonts w:hint="default" w:ascii="Symbol" w:hAnsi="Symbol"/>
+      </w:rPr>
+    </w:lvl>
+    <w:lvl xmlns:w="http://schemas.openxmlformats.org/wordprocessingml/2006/main" w:ilvl="7">
+      <w:start w:val="1"/>
+      <w:numFmt w:val="bullet"/>
+      <w:lvlText w:val="o"/>
+      <w:lvlJc w:val="left"/>
+      <w:pPr>
+        <w:ind w:left="5760" w:hanging="360"/>
+      </w:pPr>
+      <w:rPr>
+        <w:rFonts w:hint="default" w:ascii="Courier New" w:hAnsi="Courier New"/>
+      </w:rPr>
+    </w:lvl>
+    <w:lvl xmlns:w="http://schemas.openxmlformats.org/wordprocessingml/2006/main" w:ilvl="8">
+      <w:start w:val="1"/>
+      <w:numFmt w:val="bullet"/>
+      <w:lvlText w:val=""/>
+      <w:lvlJc w:val="left"/>
+      <w:pPr>
+        <w:ind w:left="6480" w:hanging="360"/>
+      </w:pPr>
+      <w:rPr>
+        <w:rFonts w:hint="default" w:ascii="Wingdings" w:hAnsi="Wingdings"/>
+      </w:rPr>
+    </w:lvl>
+  </w:abstractNum>
+  <w:abstractNum xmlns:w="http://schemas.openxmlformats.org/wordprocessingml/2006/main" w:abstractNumId="5">
+    <w:nsid w:val="480cc63c"/>
+    <w:multiLevelType xmlns:w="http://schemas.openxmlformats.org/wordprocessingml/2006/main" w:val="hybridMultilevel"/>
+    <w:lvl xmlns:w="http://schemas.openxmlformats.org/wordprocessingml/2006/main" w:ilvl="0">
+      <w:start w:val="1"/>
+      <w:numFmt w:val="bullet"/>
+      <w:lvlText w:val=""/>
+      <w:lvlJc w:val="left"/>
+      <w:pPr>
+        <w:ind w:left="720" w:hanging="360"/>
+      </w:pPr>
+      <w:rPr>
+        <w:rFonts w:hint="default" w:ascii="Symbol" w:hAnsi="Symbol"/>
+      </w:rPr>
+    </w:lvl>
+    <w:lvl xmlns:w="http://schemas.openxmlformats.org/wordprocessingml/2006/main" w:ilvl="1">
+      <w:start w:val="1"/>
+      <w:numFmt w:val="bullet"/>
+      <w:lvlText w:val="o"/>
+      <w:lvlJc w:val="left"/>
+      <w:pPr>
+        <w:ind w:left="1440" w:hanging="360"/>
+      </w:pPr>
+      <w:rPr>
+        <w:rFonts w:hint="default" w:ascii="Courier New" w:hAnsi="Courier New"/>
+      </w:rPr>
+    </w:lvl>
+    <w:lvl xmlns:w="http://schemas.openxmlformats.org/wordprocessingml/2006/main" w:ilvl="2">
+      <w:start w:val="1"/>
+      <w:numFmt w:val="bullet"/>
+      <w:lvlText w:val=""/>
+      <w:lvlJc w:val="left"/>
+      <w:pPr>
+        <w:ind w:left="2160" w:hanging="360"/>
+      </w:pPr>
+      <w:rPr>
+        <w:rFonts w:hint="default" w:ascii="Wingdings" w:hAnsi="Wingdings"/>
+      </w:rPr>
+    </w:lvl>
+    <w:lvl xmlns:w="http://schemas.openxmlformats.org/wordprocessingml/2006/main" w:ilvl="3">
+      <w:start w:val="1"/>
+      <w:numFmt w:val="bullet"/>
+      <w:lvlText w:val=""/>
+      <w:lvlJc w:val="left"/>
+      <w:pPr>
+        <w:ind w:left="2880" w:hanging="360"/>
+      </w:pPr>
+      <w:rPr>
+        <w:rFonts w:hint="default" w:ascii="Symbol" w:hAnsi="Symbol"/>
+      </w:rPr>
+    </w:lvl>
+    <w:lvl xmlns:w="http://schemas.openxmlformats.org/wordprocessingml/2006/main" w:ilvl="4">
+      <w:start w:val="1"/>
+      <w:numFmt w:val="bullet"/>
+      <w:lvlText w:val="o"/>
+      <w:lvlJc w:val="left"/>
+      <w:pPr>
+        <w:ind w:left="3600" w:hanging="360"/>
+      </w:pPr>
+      <w:rPr>
+        <w:rFonts w:hint="default" w:ascii="Courier New" w:hAnsi="Courier New"/>
+      </w:rPr>
+    </w:lvl>
+    <w:lvl xmlns:w="http://schemas.openxmlformats.org/wordprocessingml/2006/main" w:ilvl="5">
+      <w:start w:val="1"/>
+      <w:numFmt w:val="bullet"/>
+      <w:lvlText w:val=""/>
+      <w:lvlJc w:val="left"/>
+      <w:pPr>
+        <w:ind w:left="4320" w:hanging="360"/>
+      </w:pPr>
+      <w:rPr>
+        <w:rFonts w:hint="default" w:ascii="Wingdings" w:hAnsi="Wingdings"/>
+      </w:rPr>
+    </w:lvl>
+    <w:lvl xmlns:w="http://schemas.openxmlformats.org/wordprocessingml/2006/main" w:ilvl="6">
+      <w:start w:val="1"/>
+      <w:numFmt w:val="bullet"/>
+      <w:lvlText w:val=""/>
+      <w:lvlJc w:val="left"/>
+      <w:pPr>
+        <w:ind w:left="5040" w:hanging="360"/>
+      </w:pPr>
+      <w:rPr>
+        <w:rFonts w:hint="default" w:ascii="Symbol" w:hAnsi="Symbol"/>
+      </w:rPr>
+    </w:lvl>
+    <w:lvl xmlns:w="http://schemas.openxmlformats.org/wordprocessingml/2006/main" w:ilvl="7">
+      <w:start w:val="1"/>
+      <w:numFmt w:val="bullet"/>
+      <w:lvlText w:val="o"/>
+      <w:lvlJc w:val="left"/>
+      <w:pPr>
+        <w:ind w:left="5760" w:hanging="360"/>
+      </w:pPr>
+      <w:rPr>
+        <w:rFonts w:hint="default" w:ascii="Courier New" w:hAnsi="Courier New"/>
+      </w:rPr>
+    </w:lvl>
+    <w:lvl xmlns:w="http://schemas.openxmlformats.org/wordprocessingml/2006/main" w:ilvl="8">
+      <w:start w:val="1"/>
+      <w:numFmt w:val="bullet"/>
+      <w:lvlText w:val=""/>
+      <w:lvlJc w:val="left"/>
+      <w:pPr>
+        <w:ind w:left="6480" w:hanging="360"/>
+      </w:pPr>
+      <w:rPr>
+        <w:rFonts w:hint="default" w:ascii="Wingdings" w:hAnsi="Wingdings"/>
+      </w:rPr>
+    </w:lvl>
+  </w:abstractNum>
+  <w:abstractNum xmlns:w="http://schemas.openxmlformats.org/wordprocessingml/2006/main" w:abstractNumId="4">
+    <w:nsid w:val="6d48e071"/>
+    <w:multiLevelType xmlns:w="http://schemas.openxmlformats.org/wordprocessingml/2006/main" w:val="hybridMultilevel"/>
+    <w:lvl xmlns:w="http://schemas.openxmlformats.org/wordprocessingml/2006/main" w:ilvl="0">
+      <w:start w:val="1"/>
+      <w:numFmt w:val="bullet"/>
+      <w:lvlText w:val=""/>
+      <w:lvlJc w:val="left"/>
+      <w:pPr>
+        <w:ind w:left="720" w:hanging="360"/>
+      </w:pPr>
+      <w:rPr>
+        <w:rFonts w:hint="default" w:ascii="Symbol" w:hAnsi="Symbol"/>
+      </w:rPr>
+    </w:lvl>
+    <w:lvl xmlns:w="http://schemas.openxmlformats.org/wordprocessingml/2006/main" w:ilvl="1">
+      <w:start w:val="1"/>
+      <w:numFmt w:val="bullet"/>
+      <w:lvlText w:val="o"/>
+      <w:lvlJc w:val="left"/>
+      <w:pPr>
+        <w:ind w:left="1440" w:hanging="360"/>
+      </w:pPr>
+      <w:rPr>
+        <w:rFonts w:hint="default" w:ascii="Courier New" w:hAnsi="Courier New"/>
+      </w:rPr>
+    </w:lvl>
+    <w:lvl xmlns:w="http://schemas.openxmlformats.org/wordprocessingml/2006/main" w:ilvl="2">
+      <w:start w:val="1"/>
+      <w:numFmt w:val="bullet"/>
+      <w:lvlText w:val=""/>
+      <w:lvlJc w:val="left"/>
+      <w:pPr>
+        <w:ind w:left="2160" w:hanging="360"/>
+      </w:pPr>
+      <w:rPr>
+        <w:rFonts w:hint="default" w:ascii="Wingdings" w:hAnsi="Wingdings"/>
+      </w:rPr>
+    </w:lvl>
+    <w:lvl xmlns:w="http://schemas.openxmlformats.org/wordprocessingml/2006/main" w:ilvl="3">
+      <w:start w:val="1"/>
+      <w:numFmt w:val="bullet"/>
+      <w:lvlText w:val=""/>
+      <w:lvlJc w:val="left"/>
+      <w:pPr>
+        <w:ind w:left="2880" w:hanging="360"/>
+      </w:pPr>
+      <w:rPr>
+        <w:rFonts w:hint="default" w:ascii="Symbol" w:hAnsi="Symbol"/>
+      </w:rPr>
+    </w:lvl>
+    <w:lvl xmlns:w="http://schemas.openxmlformats.org/wordprocessingml/2006/main" w:ilvl="4">
+      <w:start w:val="1"/>
+      <w:numFmt w:val="bullet"/>
+      <w:lvlText w:val="o"/>
+      <w:lvlJc w:val="left"/>
+      <w:pPr>
+        <w:ind w:left="3600" w:hanging="360"/>
+      </w:pPr>
+      <w:rPr>
+        <w:rFonts w:hint="default" w:ascii="Courier New" w:hAnsi="Courier New"/>
+      </w:rPr>
+    </w:lvl>
+    <w:lvl xmlns:w="http://schemas.openxmlformats.org/wordprocessingml/2006/main" w:ilvl="5">
+      <w:start w:val="1"/>
+      <w:numFmt w:val="bullet"/>
+      <w:lvlText w:val=""/>
+      <w:lvlJc w:val="left"/>
+      <w:pPr>
+        <w:ind w:left="4320" w:hanging="360"/>
+      </w:pPr>
+      <w:rPr>
+        <w:rFonts w:hint="default" w:ascii="Wingdings" w:hAnsi="Wingdings"/>
+      </w:rPr>
+    </w:lvl>
+    <w:lvl xmlns:w="http://schemas.openxmlformats.org/wordprocessingml/2006/main" w:ilvl="6">
+      <w:start w:val="1"/>
+      <w:numFmt w:val="bullet"/>
+      <w:lvlText w:val=""/>
+      <w:lvlJc w:val="left"/>
+      <w:pPr>
+        <w:ind w:left="5040" w:hanging="360"/>
+      </w:pPr>
+      <w:rPr>
+        <w:rFonts w:hint="default" w:ascii="Symbol" w:hAnsi="Symbol"/>
+      </w:rPr>
+    </w:lvl>
+    <w:lvl xmlns:w="http://schemas.openxmlformats.org/wordprocessingml/2006/main" w:ilvl="7">
+      <w:start w:val="1"/>
+      <w:numFmt w:val="bullet"/>
+      <w:lvlText w:val="o"/>
+      <w:lvlJc w:val="left"/>
+      <w:pPr>
+        <w:ind w:left="5760" w:hanging="360"/>
+      </w:pPr>
+      <w:rPr>
+        <w:rFonts w:hint="default" w:ascii="Courier New" w:hAnsi="Courier New"/>
+      </w:rPr>
+    </w:lvl>
+    <w:lvl xmlns:w="http://schemas.openxmlformats.org/wordprocessingml/2006/main" w:ilvl="8">
+      <w:start w:val="1"/>
+      <w:numFmt w:val="bullet"/>
+      <w:lvlText w:val=""/>
+      <w:lvlJc w:val="left"/>
+      <w:pPr>
+        <w:ind w:left="6480" w:hanging="360"/>
+      </w:pPr>
+      <w:rPr>
+        <w:rFonts w:hint="default" w:ascii="Wingdings" w:hAnsi="Wingdings"/>
+      </w:rPr>
+    </w:lvl>
+  </w:abstractNum>
+  <w:abstractNum xmlns:w="http://schemas.openxmlformats.org/wordprocessingml/2006/main" w:abstractNumId="3">
+    <w:nsid w:val="e45f361"/>
+    <w:multiLevelType xmlns:w="http://schemas.openxmlformats.org/wordprocessingml/2006/main" w:val="hybridMultilevel"/>
+    <w:lvl xmlns:w="http://schemas.openxmlformats.org/wordprocessingml/2006/main" w:ilvl="0">
+      <w:start w:val="1"/>
+      <w:numFmt w:val="bullet"/>
+      <w:lvlText w:val=""/>
+      <w:lvlJc w:val="left"/>
+      <w:pPr>
+        <w:ind w:left="720" w:hanging="360"/>
+      </w:pPr>
+      <w:rPr>
+        <w:rFonts w:hint="default" w:ascii="Symbol" w:hAnsi="Symbol"/>
+      </w:rPr>
+    </w:lvl>
+    <w:lvl xmlns:w="http://schemas.openxmlformats.org/wordprocessingml/2006/main" w:ilvl="1">
+      <w:start w:val="1"/>
+      <w:numFmt w:val="bullet"/>
+      <w:lvlText w:val="o"/>
+      <w:lvlJc w:val="left"/>
+      <w:pPr>
+        <w:ind w:left="1440" w:hanging="360"/>
+      </w:pPr>
+      <w:rPr>
+        <w:rFonts w:hint="default" w:ascii="Courier New" w:hAnsi="Courier New"/>
+      </w:rPr>
+    </w:lvl>
+    <w:lvl xmlns:w="http://schemas.openxmlformats.org/wordprocessingml/2006/main" w:ilvl="2">
+      <w:start w:val="1"/>
+      <w:numFmt w:val="bullet"/>
+      <w:lvlText w:val=""/>
+      <w:lvlJc w:val="left"/>
+      <w:pPr>
+        <w:ind w:left="2160" w:hanging="360"/>
+      </w:pPr>
+      <w:rPr>
+        <w:rFonts w:hint="default" w:ascii="Wingdings" w:hAnsi="Wingdings"/>
+      </w:rPr>
+    </w:lvl>
+    <w:lvl xmlns:w="http://schemas.openxmlformats.org/wordprocessingml/2006/main" w:ilvl="3">
+      <w:start w:val="1"/>
+      <w:numFmt w:val="bullet"/>
+      <w:lvlText w:val=""/>
+      <w:lvlJc w:val="left"/>
+      <w:pPr>
+        <w:ind w:left="2880" w:hanging="360"/>
+      </w:pPr>
+      <w:rPr>
+        <w:rFonts w:hint="default" w:ascii="Symbol" w:hAnsi="Symbol"/>
+      </w:rPr>
+    </w:lvl>
+    <w:lvl xmlns:w="http://schemas.openxmlformats.org/wordprocessingml/2006/main" w:ilvl="4">
+      <w:start w:val="1"/>
+      <w:numFmt w:val="bullet"/>
+      <w:lvlText w:val="o"/>
+      <w:lvlJc w:val="left"/>
+      <w:pPr>
+        <w:ind w:left="3600" w:hanging="360"/>
+      </w:pPr>
+      <w:rPr>
+        <w:rFonts w:hint="default" w:ascii="Courier New" w:hAnsi="Courier New"/>
+      </w:rPr>
+    </w:lvl>
+    <w:lvl xmlns:w="http://schemas.openxmlformats.org/wordprocessingml/2006/main" w:ilvl="5">
+      <w:start w:val="1"/>
+      <w:numFmt w:val="bullet"/>
+      <w:lvlText w:val=""/>
+      <w:lvlJc w:val="left"/>
+      <w:pPr>
+        <w:ind w:left="4320" w:hanging="360"/>
+      </w:pPr>
+      <w:rPr>
+        <w:rFonts w:hint="default" w:ascii="Wingdings" w:hAnsi="Wingdings"/>
+      </w:rPr>
+    </w:lvl>
+    <w:lvl xmlns:w="http://schemas.openxmlformats.org/wordprocessingml/2006/main" w:ilvl="6">
+      <w:start w:val="1"/>
+      <w:numFmt w:val="bullet"/>
+      <w:lvlText w:val=""/>
+      <w:lvlJc w:val="left"/>
+      <w:pPr>
+        <w:ind w:left="5040" w:hanging="360"/>
+      </w:pPr>
+      <w:rPr>
+        <w:rFonts w:hint="default" w:ascii="Symbol" w:hAnsi="Symbol"/>
+      </w:rPr>
+    </w:lvl>
+    <w:lvl xmlns:w="http://schemas.openxmlformats.org/wordprocessingml/2006/main" w:ilvl="7">
+      <w:start w:val="1"/>
+      <w:numFmt w:val="bullet"/>
+      <w:lvlText w:val="o"/>
+      <w:lvlJc w:val="left"/>
+      <w:pPr>
+        <w:ind w:left="5760" w:hanging="360"/>
+      </w:pPr>
+      <w:rPr>
+        <w:rFonts w:hint="default" w:ascii="Courier New" w:hAnsi="Courier New"/>
+      </w:rPr>
+    </w:lvl>
+    <w:lvl xmlns:w="http://schemas.openxmlformats.org/wordprocessingml/2006/main" w:ilvl="8">
+      <w:start w:val="1"/>
+      <w:numFmt w:val="bullet"/>
+      <w:lvlText w:val=""/>
+      <w:lvlJc w:val="left"/>
+      <w:pPr>
+        <w:ind w:left="6480" w:hanging="360"/>
+      </w:pPr>
+      <w:rPr>
+        <w:rFonts w:hint="default" w:ascii="Wingdings" w:hAnsi="Wingdings"/>
+      </w:rPr>
+    </w:lvl>
+  </w:abstractNum>
+  <w:abstractNum xmlns:w="http://schemas.openxmlformats.org/wordprocessingml/2006/main" w:abstractNumId="2">
+    <w:nsid w:val="73c74278"/>
+    <w:multiLevelType xmlns:w="http://schemas.openxmlformats.org/wordprocessingml/2006/main" w:val="hybridMultilevel"/>
+    <w:lvl xmlns:w="http://schemas.openxmlformats.org/wordprocessingml/2006/main" w:ilvl="0">
+      <w:start w:val="1"/>
+      <w:numFmt w:val="bullet"/>
+      <w:lvlText w:val=""/>
+      <w:lvlJc w:val="left"/>
+      <w:pPr>
+        <w:ind w:left="720" w:hanging="360"/>
+      </w:pPr>
+      <w:rPr>
+        <w:rFonts w:hint="default" w:ascii="Symbol" w:hAnsi="Symbol"/>
+      </w:rPr>
+    </w:lvl>
+    <w:lvl xmlns:w="http://schemas.openxmlformats.org/wordprocessingml/2006/main" w:ilvl="1">
+      <w:start w:val="1"/>
+      <w:numFmt w:val="bullet"/>
+      <w:lvlText w:val="o"/>
+      <w:lvlJc w:val="left"/>
+      <w:pPr>
+        <w:ind w:left="1440" w:hanging="360"/>
+      </w:pPr>
+      <w:rPr>
+        <w:rFonts w:hint="default" w:ascii="Courier New" w:hAnsi="Courier New"/>
+      </w:rPr>
+    </w:lvl>
+    <w:lvl xmlns:w="http://schemas.openxmlformats.org/wordprocessingml/2006/main" w:ilvl="2">
+      <w:start w:val="1"/>
+      <w:numFmt w:val="bullet"/>
+      <w:lvlText w:val=""/>
+      <w:lvlJc w:val="left"/>
+      <w:pPr>
+        <w:ind w:left="2160" w:hanging="360"/>
+      </w:pPr>
+      <w:rPr>
+        <w:rFonts w:hint="default" w:ascii="Wingdings" w:hAnsi="Wingdings"/>
+      </w:rPr>
+    </w:lvl>
+    <w:lvl xmlns:w="http://schemas.openxmlformats.org/wordprocessingml/2006/main" w:ilvl="3">
+      <w:start w:val="1"/>
+      <w:numFmt w:val="bullet"/>
+      <w:lvlText w:val=""/>
+      <w:lvlJc w:val="left"/>
+      <w:pPr>
+        <w:ind w:left="2880" w:hanging="360"/>
+      </w:pPr>
+      <w:rPr>
+        <w:rFonts w:hint="default" w:ascii="Symbol" w:hAnsi="Symbol"/>
+      </w:rPr>
+    </w:lvl>
+    <w:lvl xmlns:w="http://schemas.openxmlformats.org/wordprocessingml/2006/main" w:ilvl="4">
+      <w:start w:val="1"/>
+      <w:numFmt w:val="bullet"/>
+      <w:lvlText w:val="o"/>
+      <w:lvlJc w:val="left"/>
+      <w:pPr>
+        <w:ind w:left="3600" w:hanging="360"/>
+      </w:pPr>
+      <w:rPr>
+        <w:rFonts w:hint="default" w:ascii="Courier New" w:hAnsi="Courier New"/>
+      </w:rPr>
+    </w:lvl>
+    <w:lvl xmlns:w="http://schemas.openxmlformats.org/wordprocessingml/2006/main" w:ilvl="5">
+      <w:start w:val="1"/>
+      <w:numFmt w:val="bullet"/>
+      <w:lvlText w:val=""/>
+      <w:lvlJc w:val="left"/>
+      <w:pPr>
+        <w:ind w:left="4320" w:hanging="360"/>
+      </w:pPr>
+      <w:rPr>
+        <w:rFonts w:hint="default" w:ascii="Wingdings" w:hAnsi="Wingdings"/>
+      </w:rPr>
+    </w:lvl>
+    <w:lvl xmlns:w="http://schemas.openxmlformats.org/wordprocessingml/2006/main" w:ilvl="6">
+      <w:start w:val="1"/>
+      <w:numFmt w:val="bullet"/>
+      <w:lvlText w:val=""/>
+      <w:lvlJc w:val="left"/>
+      <w:pPr>
+        <w:ind w:left="5040" w:hanging="360"/>
+      </w:pPr>
+      <w:rPr>
+        <w:rFonts w:hint="default" w:ascii="Symbol" w:hAnsi="Symbol"/>
+      </w:rPr>
+    </w:lvl>
+    <w:lvl xmlns:w="http://schemas.openxmlformats.org/wordprocessingml/2006/main" w:ilvl="7">
+      <w:start w:val="1"/>
+      <w:numFmt w:val="bullet"/>
+      <w:lvlText w:val="o"/>
+      <w:lvlJc w:val="left"/>
+      <w:pPr>
+        <w:ind w:left="5760" w:hanging="360"/>
+      </w:pPr>
+      <w:rPr>
+        <w:rFonts w:hint="default" w:ascii="Courier New" w:hAnsi="Courier New"/>
+      </w:rPr>
+    </w:lvl>
+    <w:lvl xmlns:w="http://schemas.openxmlformats.org/wordprocessingml/2006/main" w:ilvl="8">
+      <w:start w:val="1"/>
+      <w:numFmt w:val="bullet"/>
+      <w:lvlText w:val=""/>
+      <w:lvlJc w:val="left"/>
+      <w:pPr>
+        <w:ind w:left="6480" w:hanging="360"/>
+      </w:pPr>
+      <w:rPr>
+        <w:rFonts w:hint="default" w:ascii="Wingdings" w:hAnsi="Wingdings"/>
+      </w:rPr>
+    </w:lvl>
+  </w:abstractNum>
   <w:abstractNum w:abstractNumId="0" w15:restartNumberingAfterBreak="0">
     <w:nsid w:val="20CC5EEE"/>
     <w:multiLevelType w:val="hybridMultilevel"/>
@@ -2818,6 +5624,24 @@
       <w:lvlJc w:val="left"/>
     </w:lvl>
   </w:abstractNum>
+  <w:num w:numId="8">
+    <w:abstractNumId w:val="7"/>
+  </w:num>
+  <w:num w:numId="7">
+    <w:abstractNumId w:val="6"/>
+  </w:num>
+  <w:num w:numId="6">
+    <w:abstractNumId w:val="5"/>
+  </w:num>
+  <w:num w:numId="5">
+    <w:abstractNumId w:val="4"/>
+  </w:num>
+  <w:num w:numId="4">
+    <w:abstractNumId w:val="3"/>
+  </w:num>
+  <w:num w:numId="3">
+    <w:abstractNumId w:val="2"/>
+  </w:num>
   <w:num w:numId="1" w16cid:durableId="1854152369">
     <w:abstractNumId w:val="0"/>
     <w:lvlOverride w:ilvl="0">
@@ -2834,11 +5658,11 @@
 </file>
 
 <file path=word/styles.xml><?xml version="1.0" encoding="utf-8"?>
-<w:styles xmlns:mc="http://schemas.openxmlformats.org/markup-compatibility/2006" xmlns:r="http://schemas.openxmlformats.org/officeDocument/2006/relationships" xmlns:w="http://schemas.openxmlformats.org/wordprocessingml/2006/main" xmlns:w14="http://schemas.microsoft.com/office/word/2010/wordml" xmlns:w15="http://schemas.microsoft.com/office/word/2012/wordml" xmlns:w16cex="http://schemas.microsoft.com/office/word/2018/wordml/cex" xmlns:w16cid="http://schemas.microsoft.com/office/word/2016/wordml/cid" xmlns:w16="http://schemas.microsoft.com/office/word/2018/wordml" xmlns:w16du="http://schemas.microsoft.com/office/word/2023/wordml/word16du" xmlns:w16sdtdh="http://schemas.microsoft.com/office/word/2020/wordml/sdtdatahash" xmlns:w16sdtfl="http://schemas.microsoft.com/office/word/2024/wordml/sdtformatlock" xmlns:w16se="http://schemas.microsoft.com/office/word/2015/wordml/symex" mc:Ignorable="w14 w15 w16se w16cid w16 w16cex w16sdtdh w16sdtfl w16du">
+<w:styles xmlns:wp14="http://schemas.microsoft.com/office/word/2010/wordprocessingDrawing" xmlns:mc="http://schemas.openxmlformats.org/markup-compatibility/2006" xmlns:r="http://schemas.openxmlformats.org/officeDocument/2006/relationships" xmlns:w="http://schemas.openxmlformats.org/wordprocessingml/2006/main" xmlns:w14="http://schemas.microsoft.com/office/word/2010/wordml" xmlns:w15="http://schemas.microsoft.com/office/word/2012/wordml" xmlns:w16cex="http://schemas.microsoft.com/office/word/2018/wordml/cex" xmlns:w16cid="http://schemas.microsoft.com/office/word/2016/wordml/cid" xmlns:w16="http://schemas.microsoft.com/office/word/2018/wordml" xmlns:w16du="http://schemas.microsoft.com/office/word/2023/wordml/word16du" xmlns:w16sdtdh="http://schemas.microsoft.com/office/word/2020/wordml/sdtdatahash" xmlns:w16sdtfl="http://schemas.microsoft.com/office/word/2024/wordml/sdtformatlock" xmlns:w16se="http://schemas.microsoft.com/office/word/2015/wordml/symex" mc:Ignorable="w14 w15 w16se w16cid w16 w16cex w16sdtdh w16sdtfl w16du wp14">
   <w:docDefaults>
     <w:rPrDefault>
       <w:rPr>
-        <w:rFonts w:ascii="Calibri" w:eastAsia="Calibri" w:hAnsi="Calibri" w:cs="Calibri"/>
+        <w:rFonts w:ascii="Calibri" w:hAnsi="Calibri" w:eastAsia="Calibri" w:cs="Calibri"/>
         <w:sz w:val="22"/>
         <w:szCs w:val="22"/>
         <w:lang w:val="en-US" w:eastAsia="en-US" w:bidi="ar-SA"/>
@@ -2853,14 +5677,14 @@
   <w:latentStyles w:defLockedState="0" w:defUIPriority="99" w:defSemiHidden="0" w:defUnhideWhenUsed="0" w:defQFormat="0" w:count="376">
     <w:lsdException w:name="Normal" w:uiPriority="0" w:qFormat="1"/>
     <w:lsdException w:name="heading 1" w:uiPriority="9" w:qFormat="1"/>
-    <w:lsdException w:name="heading 2" w:semiHidden="1" w:uiPriority="9" w:unhideWhenUsed="1" w:qFormat="1"/>
-    <w:lsdException w:name="heading 3" w:semiHidden="1" w:uiPriority="9" w:unhideWhenUsed="1" w:qFormat="1"/>
-    <w:lsdException w:name="heading 4" w:semiHidden="1" w:uiPriority="9" w:unhideWhenUsed="1" w:qFormat="1"/>
-    <w:lsdException w:name="heading 5" w:semiHidden="1" w:uiPriority="9" w:unhideWhenUsed="1" w:qFormat="1"/>
-    <w:lsdException w:name="heading 6" w:semiHidden="1" w:uiPriority="9" w:unhideWhenUsed="1" w:qFormat="1"/>
-    <w:lsdException w:name="heading 7" w:semiHidden="1" w:uiPriority="9" w:unhideWhenUsed="1" w:qFormat="1"/>
-    <w:lsdException w:name="heading 8" w:semiHidden="1" w:uiPriority="9" w:unhideWhenUsed="1" w:qFormat="1"/>
-    <w:lsdException w:name="heading 9" w:semiHidden="1" w:uiPriority="9" w:unhideWhenUsed="1" w:qFormat="1"/>
+    <w:lsdException w:name="heading 2" w:uiPriority="9" w:semiHidden="1" w:unhideWhenUsed="1" w:qFormat="1"/>
+    <w:lsdException w:name="heading 3" w:uiPriority="9" w:semiHidden="1" w:unhideWhenUsed="1" w:qFormat="1"/>
+    <w:lsdException w:name="heading 4" w:uiPriority="9" w:semiHidden="1" w:unhideWhenUsed="1" w:qFormat="1"/>
+    <w:lsdException w:name="heading 5" w:uiPriority="9" w:semiHidden="1" w:unhideWhenUsed="1" w:qFormat="1"/>
+    <w:lsdException w:name="heading 6" w:uiPriority="9" w:semiHidden="1" w:unhideWhenUsed="1" w:qFormat="1"/>
+    <w:lsdException w:name="heading 7" w:uiPriority="9" w:semiHidden="1" w:unhideWhenUsed="1" w:qFormat="1"/>
+    <w:lsdException w:name="heading 8" w:uiPriority="9" w:semiHidden="1" w:unhideWhenUsed="1" w:qFormat="1"/>
+    <w:lsdException w:name="heading 9" w:uiPriority="9" w:semiHidden="1" w:unhideWhenUsed="1" w:qFormat="1"/>
     <w:lsdException w:name="index 1" w:semiHidden="1" w:unhideWhenUsed="1"/>
     <w:lsdException w:name="index 2" w:semiHidden="1" w:unhideWhenUsed="1"/>
     <w:lsdException w:name="index 3" w:semiHidden="1" w:unhideWhenUsed="1"/>
@@ -2870,22 +5694,22 @@
     <w:lsdException w:name="index 7" w:semiHidden="1" w:unhideWhenUsed="1"/>
     <w:lsdException w:name="index 8" w:semiHidden="1" w:unhideWhenUsed="1"/>
     <w:lsdException w:name="index 9" w:semiHidden="1" w:unhideWhenUsed="1"/>
-    <w:lsdException w:name="toc 1" w:semiHidden="1" w:uiPriority="39" w:unhideWhenUsed="1"/>
-    <w:lsdException w:name="toc 2" w:semiHidden="1" w:uiPriority="39" w:unhideWhenUsed="1"/>
-    <w:lsdException w:name="toc 3" w:semiHidden="1" w:uiPriority="39" w:unhideWhenUsed="1"/>
-    <w:lsdException w:name="toc 4" w:semiHidden="1" w:uiPriority="39" w:unhideWhenUsed="1"/>
-    <w:lsdException w:name="toc 5" w:semiHidden="1" w:uiPriority="39" w:unhideWhenUsed="1"/>
-    <w:lsdException w:name="toc 6" w:semiHidden="1" w:uiPriority="39" w:unhideWhenUsed="1"/>
-    <w:lsdException w:name="toc 7" w:semiHidden="1" w:uiPriority="39" w:unhideWhenUsed="1"/>
-    <w:lsdException w:name="toc 8" w:semiHidden="1" w:uiPriority="39" w:unhideWhenUsed="1"/>
-    <w:lsdException w:name="toc 9" w:semiHidden="1" w:uiPriority="39" w:unhideWhenUsed="1"/>
+    <w:lsdException w:name="toc 1" w:uiPriority="39" w:semiHidden="1" w:unhideWhenUsed="1"/>
+    <w:lsdException w:name="toc 2" w:uiPriority="39" w:semiHidden="1" w:unhideWhenUsed="1"/>
+    <w:lsdException w:name="toc 3" w:uiPriority="39" w:semiHidden="1" w:unhideWhenUsed="1"/>
+    <w:lsdException w:name="toc 4" w:uiPriority="39" w:semiHidden="1" w:unhideWhenUsed="1"/>
+    <w:lsdException w:name="toc 5" w:uiPriority="39" w:semiHidden="1" w:unhideWhenUsed="1"/>
+    <w:lsdException w:name="toc 6" w:uiPriority="39" w:semiHidden="1" w:unhideWhenUsed="1"/>
+    <w:lsdException w:name="toc 7" w:uiPriority="39" w:semiHidden="1" w:unhideWhenUsed="1"/>
+    <w:lsdException w:name="toc 8" w:uiPriority="39" w:semiHidden="1" w:unhideWhenUsed="1"/>
+    <w:lsdException w:name="toc 9" w:uiPriority="39" w:semiHidden="1" w:unhideWhenUsed="1"/>
     <w:lsdException w:name="Normal Indent" w:semiHidden="1" w:unhideWhenUsed="1"/>
     <w:lsdException w:name="footnote text" w:semiHidden="1" w:unhideWhenUsed="1"/>
     <w:lsdException w:name="annotation text" w:semiHidden="1" w:unhideWhenUsed="1"/>
     <w:lsdException w:name="header" w:semiHidden="1" w:unhideWhenUsed="1"/>
     <w:lsdException w:name="footer" w:semiHidden="1" w:unhideWhenUsed="1"/>
     <w:lsdException w:name="index heading" w:semiHidden="1" w:unhideWhenUsed="1"/>
-    <w:lsdException w:name="caption" w:semiHidden="1" w:uiPriority="35" w:unhideWhenUsed="1" w:qFormat="1"/>
+    <w:lsdException w:name="caption" w:uiPriority="35" w:semiHidden="1" w:unhideWhenUsed="1" w:qFormat="1"/>
     <w:lsdException w:name="table of figures" w:semiHidden="1" w:unhideWhenUsed="1"/>
     <w:lsdException w:name="envelope address" w:semiHidden="1" w:unhideWhenUsed="1"/>
     <w:lsdException w:name="envelope return" w:semiHidden="1" w:unhideWhenUsed="1"/>
@@ -2916,7 +5740,7 @@
     <w:lsdException w:name="Title" w:uiPriority="10" w:qFormat="1"/>
     <w:lsdException w:name="Closing" w:semiHidden="1" w:unhideWhenUsed="1"/>
     <w:lsdException w:name="Signature" w:semiHidden="1" w:unhideWhenUsed="1"/>
-    <w:lsdException w:name="Default Paragraph Font" w:semiHidden="1" w:uiPriority="1" w:unhideWhenUsed="1"/>
+    <w:lsdException w:name="Default Paragraph Font" w:uiPriority="1" w:semiHidden="1" w:unhideWhenUsed="1"/>
     <w:lsdException w:name="Body Text" w:semiHidden="1" w:unhideWhenUsed="1"/>
     <w:lsdException w:name="Body Text Indent" w:semiHidden="1" w:unhideWhenUsed="1"/>
     <w:lsdException w:name="List Continue" w:semiHidden="1" w:unhideWhenUsed="1"/>
@@ -3116,8 +5940,8 @@
     <w:lsdException w:name="Subtle Reference" w:uiPriority="31" w:qFormat="1"/>
     <w:lsdException w:name="Intense Reference" w:uiPriority="32" w:qFormat="1"/>
     <w:lsdException w:name="Book Title" w:uiPriority="33" w:qFormat="1"/>
-    <w:lsdException w:name="Bibliography" w:semiHidden="1" w:uiPriority="37" w:unhideWhenUsed="1"/>
-    <w:lsdException w:name="TOC Heading" w:semiHidden="1" w:uiPriority="39" w:unhideWhenUsed="1" w:qFormat="1"/>
+    <w:lsdException w:name="Bibliography" w:uiPriority="37" w:semiHidden="1" w:unhideWhenUsed="1"/>
+    <w:lsdException w:name="TOC Heading" w:uiPriority="39" w:semiHidden="1" w:unhideWhenUsed="1" w:qFormat="1"/>
     <w:lsdException w:name="Plain Table 1" w:uiPriority="41"/>
     <w:lsdException w:name="Plain Table 2" w:uiPriority="42"/>
     <w:lsdException w:name="Plain Table 3" w:uiPriority="43"/>
@@ -3228,7 +6052,7 @@
     <w:lsdException w:name="Unresolved Mention" w:semiHidden="1" w:unhideWhenUsed="1"/>
     <w:lsdException w:name="Smart Link" w:semiHidden="1" w:unhideWhenUsed="1"/>
   </w:latentStyles>
-  <w:style w:type="paragraph" w:default="1" w:styleId="Normal">
+  <w:style w:type="paragraph" w:styleId="Normal" w:default="1">
     <w:name w:val="Normal"/>
     <w:qFormat/>
   </w:style>
@@ -3320,13 +6144,13 @@
       <w:color w:val="1F4D78"/>
     </w:rPr>
   </w:style>
-  <w:style w:type="character" w:default="1" w:styleId="DefaultParagraphFont">
+  <w:style w:type="character" w:styleId="DefaultParagraphFont" w:default="1">
     <w:name w:val="Default Paragraph Font"/>
     <w:uiPriority w:val="1"/>
     <w:semiHidden/>
     <w:unhideWhenUsed/>
   </w:style>
-  <w:style w:type="table" w:default="1" w:styleId="TableNormal">
+  <w:style w:type="table" w:styleId="TableNormal" w:default="1">
     <w:name w:val="Normal Table"/>
     <w:uiPriority w:val="99"/>
     <w:semiHidden/>
@@ -3341,7 +6165,7 @@
       </w:tblCellMar>
     </w:tblPr>
   </w:style>
-  <w:style w:type="numbering" w:default="1" w:styleId="NoList">
+  <w:style w:type="numbering" w:styleId="NoList" w:default="1">
     <w:name w:val="No List"/>
     <w:uiPriority w:val="99"/>
     <w:semiHidden/>
@@ -3356,7 +6180,7 @@
       <w:szCs w:val="56"/>
     </w:rPr>
   </w:style>
-  <w:style w:type="paragraph" w:customStyle="1" w:styleId="Strong1">
+  <w:style w:type="paragraph" w:styleId="Strong1" w:customStyle="1">
     <w:name w:val="Strong1"/>
     <w:qFormat/>
     <w:rPr>
@@ -3400,7 +6224,7 @@
       <w:szCs w:val="20"/>
     </w:rPr>
   </w:style>
-  <w:style w:type="character" w:customStyle="1" w:styleId="FootnoteTextChar">
+  <w:style w:type="character" w:styleId="FootnoteTextChar" w:customStyle="1">
     <w:name w:val="Footnote Text Char"/>
     <w:link w:val="FootnoteText"/>
     <w:uiPriority w:val="99"/>
@@ -3434,7 +6258,7 @@
       <w:szCs w:val="20"/>
     </w:rPr>
   </w:style>
-  <w:style w:type="character" w:customStyle="1" w:styleId="EndnoteTextChar">
+  <w:style w:type="character" w:styleId="EndnoteTextChar" w:customStyle="1">
     <w:name w:val="Endnote Text Char"/>
     <w:link w:val="EndnoteText"/>
     <w:uiPriority w:val="99"/>
@@ -3460,7 +6284,7 @@
       <w:spacing w:line="240" w:lineRule="auto"/>
     </w:pPr>
   </w:style>
-  <w:style w:type="character" w:customStyle="1" w:styleId="HeaderChar">
+  <w:style w:type="character" w:styleId="HeaderChar" w:customStyle="1">
     <w:name w:val="Header Char"/>
     <w:basedOn w:val="DefaultParagraphFont"/>
     <w:link w:val="Header"/>
@@ -3482,7 +6306,7 @@
       <w:spacing w:line="240" w:lineRule="auto"/>
     </w:pPr>
   </w:style>
-  <w:style w:type="character" w:customStyle="1" w:styleId="FooterChar">
+  <w:style w:type="character" w:styleId="FooterChar" w:customStyle="1">
     <w:name w:val="Footer Char"/>
     <w:basedOn w:val="DefaultParagraphFont"/>
     <w:link w:val="Footer"/>
@@ -3493,7 +6317,7 @@
 </file>
 
 <file path=word/theme/theme1.xml><?xml version="1.0" encoding="utf-8"?>
-<a:theme xmlns:a="http://schemas.openxmlformats.org/drawingml/2006/main" name="Office Theme">
+<a:theme xmlns:a="http://schemas.openxmlformats.org/drawingml/2006/main" xmlns:thm15="http://schemas.microsoft.com/office/thememl/2012/main" name="Office Theme">
   <a:themeElements>
     <a:clrScheme name="Office">
       <a:dk1>

</xml_diff>